<commit_message>
clean up uneeded file for submission
Signed-off-by: AriBlumstein <ayb1998@aol.com>
</commit_message>
<xml_diff>
--- a/Model Weight Initialization.docx
+++ b/Model Weight Initialization.docx
@@ -183,7 +183,16 @@
         <w:t xml:space="preserve">approximately </w:t>
       </w:r>
       <w:r>
-        <w:t>2.5 million parameters, the model utilized a sequence length of 128 tokens and implemented Pre-Layer Normalization.</w:t>
+        <w:t>2.5 million parameters, the model utilized a sequence length of 128 tokens and implemented Pre-Layer Normalization</w:t>
+      </w:r>
+      <w:r>
+        <w:rPr>
+          <w:lang w:val="en-US"/>
+        </w:rPr>
+        <w:t xml:space="preserve"> and residual connections</w:t>
+      </w:r>
+      <w:r>
+        <w:t>.</w:t>
       </w:r>
     </w:p>
     <w:p>
@@ -252,6 +261,11 @@
       </w:r>
     </w:p>
     <w:p>
+      <w:pPr>
+        <w:rPr>
+          <w:lang w:val="en-US"/>
+        </w:rPr>
+      </w:pPr>
       <w:r>
         <w:t>To enhance generalization, a subsequent experiment introduced dropout layers</w:t>
       </w:r>
@@ -263,6 +277,12 @@
       </w:r>
       <w:r>
         <w:t xml:space="preserve"> immediately following the initial embedding and after each causal self-attention mechanism. This addition resulted in a slightly higher final loss of 0.31 over the same 50,000-batch interval. This increase was expected, as dropout serves as a regularization technique that prevents overfitting by injecting stochastic noise into the learning process, effectively trading a marginal degree of training optimization for increased model robustness and better performance on unseen data.</w:t>
+      </w:r>
+      <w:r>
+        <w:rPr>
+          <w:lang w:val="en-US"/>
+        </w:rPr>
+        <w:t xml:space="preserve"> Experiments between pre-norm normalization and post-norm normalization did not yield significant differences. </w:t>
       </w:r>
     </w:p>
     <w:p>
@@ -433,7 +453,16 @@
         <w:t>9</w:t>
       </w:r>
       <w:r>
-        <w:t xml:space="preserve"> after the full 50,000-batch duration. It should be noted that the Hebrew configuration considered a vocabulary of 159 tokens, bringing the total parameter count to approximately 5.18 million. While these architectural and scheduling adjustments significantly improved the final loss and mitigated training instability, they necessitated a longer training duration and increased computational overhead compared to earlier iterations. This was a direct result of the increased layer count and expanded dimensions</w:t>
+        <w:t xml:space="preserve"> after the full 50,000-batch duration</w:t>
+      </w:r>
+      <w:r>
+        <w:rPr>
+          <w:lang w:val="en-US"/>
+        </w:rPr>
+        <w:t xml:space="preserve"> (3,200,000 sequences)</w:t>
+      </w:r>
+      <w:r>
+        <w:t>. It should be noted that the Hebrew configuration considered a vocabulary of 159 tokens, bringing the total parameter count to approximately 5.18 million. While these architectural and scheduling adjustments significantly improved the final loss and mitigated training instability, they necessitated a longer training duration and increased computational overhead compared to earlier iterations. This was a direct result of the increased layer count and expanded dimensions</w:t>
       </w:r>
       <w:r>
         <w:rPr>
@@ -717,13 +746,34 @@
         </w:rPr>
       </w:pPr>
       <w:r>
-        <w:t>For each dataset, ten unique architectural combinations were trialed to identify the optimal configuration. The scope was constrained to ten iterations due to limited computational resources and associated costs. To prevent overfitting and unnecessary computation, an early stopping condition was implemented, halting training when the validation loss reached 1.5 times its recorded minimum. The following graphs summarize the training and validation losses achieved across these trials.</w:t>
-      </w:r>
-      <w:r>
-        <w:rPr>
-          <w:lang w:val="en-US"/>
-        </w:rPr>
-        <w:t xml:space="preserve"> Losses were recorded </w:t>
+        <w:t>For each dataset, ten unique architectural combinations</w:t>
+      </w:r>
+      <w:r>
+        <w:rPr>
+          <w:lang w:val="en-US"/>
+        </w:rPr>
+        <w:t xml:space="preserve"> for each language</w:t>
+      </w:r>
+      <w:r>
+        <w:t xml:space="preserve"> were trialed to identify the optimal configuration. The scope was constrained to ten iterations due to limited computational resources and associated costs. To prevent overfitting and unnecessary computation, an early stopping condition was implemented, halting training when the validation loss reached 1.5 times its recorded minimum. The following graphs summarize the training and validation losses achieved across these trials.</w:t>
+      </w:r>
+      <w:r>
+        <w:rPr>
+          <w:lang w:val="en-US"/>
+        </w:rPr>
+        <w:t xml:space="preserve"> Losses were re</w:t>
+      </w:r>
+      <w:r>
+        <w:rPr>
+          <w:lang w:val="en-US"/>
+        </w:rPr>
+        <w:t xml:space="preserve">corded every 10 batches. </w:t>
+      </w:r>
+      <w:r>
+        <w:rPr>
+          <w:lang w:val="en-US"/>
+        </w:rPr>
+        <w:t xml:space="preserve"> </w:t>
       </w:r>
     </w:p>
     <w:p>
@@ -1741,16 +1791,26 @@
         <w:rPr>
           <w:lang w:val="en-US"/>
         </w:rPr>
-        <w:t xml:space="preserve"> in the specific type </w:t>
-      </w:r>
-      <w:proofErr w:type="spellStart"/>
-      <w:r>
-        <w:rPr>
-          <w:lang w:val="en-US"/>
-        </w:rPr>
-        <w:t>dats</w:t>
-      </w:r>
-      <w:proofErr w:type="spellEnd"/>
+        <w:t xml:space="preserve"> in the specific type dat</w:t>
+      </w:r>
+      <w:r>
+        <w:rPr>
+          <w:lang w:val="en-US"/>
+        </w:rPr>
+        <w:t>a</w:t>
+      </w:r>
+      <w:r>
+        <w:rPr>
+          <w:lang w:val="en-US"/>
+        </w:rPr>
+        <w:t>s</w:t>
+      </w:r>
+      <w:r>
+        <w:rPr>
+          <w:lang w:val="en-US"/>
+        </w:rPr>
+        <w:t>ets</w:t>
+      </w:r>
       <w:r>
         <w:t>, leading the model to optimize for specific nuances of the training data rather than universal features.</w:t>
       </w:r>
@@ -1851,7 +1911,37 @@
         </w:numPr>
       </w:pPr>
       <w:r>
-        <w:t>Full Dataset Training: The most effective configuration utilized 7 layers, 8 heads, and a 256 embedding dimension (with a 1024 MLP). Training was conducted with a 5e-4 learning rate using cosine annealing, 0.1 dropout (applied after initial embedding and causal attention), and 0.1 weight decay. This 5.13 million parameter model achieved a final loss of 0.12 after approximately 45,000 batches of 64-sequence lengths (2,880,000 total sequences).</w:t>
+        <w:t>Full Dataset Training: The most effective configuration utilized 7 layers, 8 heads, and a 256 embedding dimension (with a 1024 MLP). Training was conducted with a 5e-4 learning rate using cosine annealing</w:t>
+      </w:r>
+      <w:r>
+        <w:rPr>
+          <w:lang w:val="en-US"/>
+        </w:rPr>
+        <w:t xml:space="preserve"> scheduler for a maximum of 50</w:t>
+      </w:r>
+      <w:r>
+        <w:rPr>
+          <w:lang w:val="en-US"/>
+        </w:rPr>
+        <w:t>,</w:t>
+      </w:r>
+      <w:r>
+        <w:rPr>
+          <w:lang w:val="en-US"/>
+        </w:rPr>
+        <w:t>000 batches</w:t>
+      </w:r>
+      <w:r>
+        <w:t>, 0.1 dropout (applied after initial embedding and causal attention),</w:t>
+      </w:r>
+      <w:r>
+        <w:rPr>
+          <w:lang w:val="en-US"/>
+        </w:rPr>
+        <w:t xml:space="preserve"> pre-norm layer normalization with residual connections,</w:t>
+      </w:r>
+      <w:r>
+        <w:t xml:space="preserve"> and 0.1 weight decay. This 5.13 million parameter model achieved a final loss of 0.12 after approximately 45,000 batches of 64-sequence lengths (2,880,000 total sequences).</w:t>
       </w:r>
     </w:p>
     <w:p>
@@ -1862,7 +1952,46 @@
         </w:numPr>
       </w:pPr>
       <w:r>
-        <w:t xml:space="preserve">90/10 Validation Split: The top performer (Trial 6) featured 8 layers, 8 heads, and a 256 embedding size (totaling 5.86 million parameters). With a 0.0046 learning rate, 0.0379 weight decay, and 0.1 dropout, it achieved a </w:t>
+        <w:t>90/10 Validation Split: The top performer (Trial 6) featured 8 layers, 8 heads, and a 256 embedding size</w:t>
+      </w:r>
+      <w:r>
+        <w:rPr>
+          <w:lang w:val="en-US"/>
+        </w:rPr>
+        <w:t xml:space="preserve"> (1024 MLP),</w:t>
+      </w:r>
+      <w:r>
+        <w:t xml:space="preserve"> (totaling 5.86 million parameters). With a 0.0046 learning rate</w:t>
+      </w:r>
+      <w:r>
+        <w:rPr>
+          <w:lang w:val="en-US"/>
+        </w:rPr>
+        <w:t xml:space="preserve"> with a cosine annealing scheduler for a maximum of 50</w:t>
+      </w:r>
+      <w:r>
+        <w:rPr>
+          <w:lang w:val="en-US"/>
+        </w:rPr>
+        <w:t>,</w:t>
+      </w:r>
+      <w:r>
+        <w:rPr>
+          <w:lang w:val="en-US"/>
+        </w:rPr>
+        <w:t>000 batches</w:t>
+      </w:r>
+      <w:r>
+        <w:t>, 0.0379 weight decay, and 0.1 dropout,</w:t>
+      </w:r>
+      <w:r>
+        <w:rPr>
+          <w:lang w:val="en-US"/>
+        </w:rPr>
+        <w:t xml:space="preserve"> pre-norm layer normalization and residual connections,</w:t>
+      </w:r>
+      <w:r>
+        <w:t xml:space="preserve"> it achieved a </w:t>
       </w:r>
       <w:r>
         <w:rPr>
@@ -1892,7 +2021,26 @@
         </w:numPr>
       </w:pPr>
       <w:r>
-        <w:t>Full Dataset Training: Mirroring the English architecture, this model used 7 layers, 8 heads, a 256 embedding dimension, and a 1024 MLP. Employing identical hyperparameters (5e-4 learning rate with cosine annealing, 0.1 dropout, and 0.1 weight decay), it achieved a loss of 0.09 after 50,000 batches (3,200,000 sequences).</w:t>
+        <w:lastRenderedPageBreak/>
+        <w:t>Full Dataset Training: Mirroring the English architecture, this model used 7 layers, 8 heads, a 256 embedding dimension, and a 1024 MLP. Employing identical hyperparameters (5e-4 learning rate with cosine annealing, 0.1 dropout, and 0.1 weight decay)</w:t>
+      </w:r>
+      <w:r>
+        <w:rPr>
+          <w:lang w:val="en-US"/>
+        </w:rPr>
+        <w:t xml:space="preserve"> and similar architectural choices (pre-norm layer normalization and residual connections)</w:t>
+      </w:r>
+      <w:r>
+        <w:t>,</w:t>
+      </w:r>
+      <w:r>
+        <w:rPr>
+          <w:lang w:val="en-US"/>
+        </w:rPr>
+        <w:t xml:space="preserve"> and cosine annealing learning rate scheduler,</w:t>
+      </w:r>
+      <w:r>
+        <w:t xml:space="preserve"> it achieved a loss of 0.09 after 50,000 batches (3,200,000 sequences).</w:t>
       </w:r>
     </w:p>
     <w:p>
@@ -1903,8 +2051,43 @@
         </w:numPr>
       </w:pPr>
       <w:r>
-        <w:lastRenderedPageBreak/>
-        <w:t>90/10 Validation Split: The best-performing Hebrew model (Trial 4) utilized a leaner architecture of 8 layers, 6 heads, a 192 embedding size, and a 768 MLP, resulting in 3.35 million parameters. Using a 0.00212 learning rate, 0.078 weight decay, and 0.1 dropout, it reached its best validation loss of 2.423 at 2,000 batches (128,000 sequences) with a training loss of 1.44. The final training loss reached 0.288 after 7,160 batches (458,240 sequences).</w:t>
+        <w:t>90/10 Validation Split: The best-performing Hebrew model (Trial 4) utilized a leaner architecture of 8 layers, 6 heads, a 192 embedding size, and a 768 MLP, resulting in 3.35 million parameters. Using a 0.00212 learning rate</w:t>
+      </w:r>
+      <w:r>
+        <w:rPr>
+          <w:lang w:val="en-US"/>
+        </w:rPr>
+        <w:t xml:space="preserve"> with a cosine annealing scheduler for a maximum of 50</w:t>
+      </w:r>
+      <w:r>
+        <w:rPr>
+          <w:lang w:val="en-US"/>
+        </w:rPr>
+        <w:t>,</w:t>
+      </w:r>
+      <w:r>
+        <w:rPr>
+          <w:lang w:val="en-US"/>
+        </w:rPr>
+        <w:t>000 batches</w:t>
+      </w:r>
+      <w:r>
+        <w:t>, 0.078 weight decay, and 0.1 dropout</w:t>
+      </w:r>
+      <w:r>
+        <w:rPr>
+          <w:lang w:val="en-US"/>
+        </w:rPr>
+        <w:t xml:space="preserve"> pre-norm layer normalization and residual connections</w:t>
+      </w:r>
+      <w:r>
+        <w:t>, it reached its best validation loss of 2.423 at 2,000 batches (128,000 sequences) with a training loss of 1.44. The final training loss reached 0.288 after 7,160 batches (458,240 sequences</w:t>
+      </w:r>
+      <w:r>
+        <w:rPr>
+          <w:lang w:val="en-US"/>
+        </w:rPr>
+        <w:t>) after which the stopping conditions were met.</w:t>
       </w:r>
     </w:p>
     <w:p>
@@ -2022,6 +2205,7 @@
         </w:numPr>
       </w:pPr>
       <w:r>
+        <w:lastRenderedPageBreak/>
         <w:t>Cross-Layer Analysis: This standardization allowed for a direct comparison of how different layers view the same linguistic structures, providing a clean look at the model's internal hierarchy.</w:t>
       </w:r>
     </w:p>
@@ -2032,23 +2216,40 @@
         </w:rPr>
       </w:pPr>
       <w:r>
-        <w:t>The following heatmaps represent a selection of attention distributions across various layers for several five-letter test words.</w:t>
-      </w:r>
-    </w:p>
-    <w:p>
-      <w:pPr>
-        <w:rPr>
-          <w:lang w:val="en-US"/>
-        </w:rPr>
-      </w:pPr>
-      <w:r>
-        <w:rPr>
-          <w:noProof/>
-          <w:lang w:val="en-US"/>
-        </w:rPr>
-        <w:lastRenderedPageBreak/>
+        <w:t xml:space="preserve">The following heatmaps represent a selection of attention distributions across various layers for </w:t>
+      </w:r>
+      <w:r>
+        <w:rPr>
+          <w:lang w:val="en-US"/>
+        </w:rPr>
+        <w:t>some of the</w:t>
+      </w:r>
+      <w:r>
+        <w:t xml:space="preserve"> five-letter test words</w:t>
+      </w:r>
+      <w:r>
+        <w:rPr>
+          <w:lang w:val="en-US"/>
+        </w:rPr>
+        <w:t xml:space="preserve"> used</w:t>
+      </w:r>
+      <w:r>
+        <w:t>.</w:t>
+      </w:r>
+    </w:p>
+    <w:p>
+      <w:pPr>
+        <w:rPr>
+          <w:lang w:val="en-US"/>
+        </w:rPr>
+      </w:pPr>
+      <w:r>
+        <w:rPr>
+          <w:noProof/>
+          <w:lang w:val="en-US"/>
+        </w:rPr>
         <w:drawing>
-          <wp:inline distT="0" distB="0" distL="0" distR="0" wp14:anchorId="50217D0E" wp14:editId="48A64B33">
+          <wp:inline distT="0" distB="0" distL="0" distR="0" wp14:anchorId="50217D0E" wp14:editId="2937AC1E">
             <wp:extent cx="5731510" cy="2865755"/>
             <wp:effectExtent l="0" t="0" r="2540" b="0"/>
             <wp:docPr id="1419657560" name="Picture 48"/>
@@ -2095,7 +2296,7 @@
           <w:lang w:val="en-US"/>
         </w:rPr>
         <w:drawing>
-          <wp:inline distT="0" distB="0" distL="0" distR="0" wp14:anchorId="3E903E87" wp14:editId="7F645F3B">
+          <wp:inline distT="0" distB="0" distL="0" distR="0" wp14:anchorId="3E903E87" wp14:editId="57A9D405">
             <wp:extent cx="5731510" cy="2865755"/>
             <wp:effectExtent l="0" t="0" r="2540" b="0"/>
             <wp:docPr id="454731531" name="Picture 49"/>
@@ -2141,8 +2342,9 @@
           <w:noProof/>
           <w:lang w:val="en-US"/>
         </w:rPr>
+        <w:lastRenderedPageBreak/>
         <w:drawing>
-          <wp:inline distT="0" distB="0" distL="0" distR="0" wp14:anchorId="30600F17" wp14:editId="3FCB901C">
+          <wp:inline distT="0" distB="0" distL="0" distR="0" wp14:anchorId="30600F17" wp14:editId="4E1D5DF1">
             <wp:extent cx="5731510" cy="2865755"/>
             <wp:effectExtent l="0" t="0" r="2540" b="0"/>
             <wp:docPr id="1782526547" name="Picture 50"/>
@@ -2188,9 +2390,8 @@
           <w:noProof/>
           <w:lang w:val="en-US"/>
         </w:rPr>
-        <w:lastRenderedPageBreak/>
         <w:drawing>
-          <wp:inline distT="0" distB="0" distL="0" distR="0" wp14:anchorId="16B9EFEA" wp14:editId="406A0EEE">
+          <wp:inline distT="0" distB="0" distL="0" distR="0" wp14:anchorId="16B9EFEA" wp14:editId="1F7B0938">
             <wp:extent cx="5731510" cy="2865755"/>
             <wp:effectExtent l="0" t="0" r="2540" b="0"/>
             <wp:docPr id="1972536739" name="Picture 51"/>
@@ -2237,7 +2438,7 @@
           <w:lang w:val="en-US"/>
         </w:rPr>
         <w:drawing>
-          <wp:inline distT="0" distB="0" distL="0" distR="0" wp14:anchorId="5576E422" wp14:editId="21D340CF">
+          <wp:inline distT="0" distB="0" distL="0" distR="0" wp14:anchorId="5576E422" wp14:editId="2809EAA2">
             <wp:extent cx="5731510" cy="2865755"/>
             <wp:effectExtent l="0" t="0" r="2540" b="0"/>
             <wp:docPr id="433359026" name="Picture 52"/>
@@ -2283,8 +2484,9 @@
           <w:noProof/>
           <w:lang w:val="en-US"/>
         </w:rPr>
+        <w:lastRenderedPageBreak/>
         <w:drawing>
-          <wp:inline distT="0" distB="0" distL="0" distR="0" wp14:anchorId="35FD3AEE" wp14:editId="1B5EE065">
+          <wp:inline distT="0" distB="0" distL="0" distR="0" wp14:anchorId="35FD3AEE" wp14:editId="77EF07C4">
             <wp:extent cx="5731510" cy="2865755"/>
             <wp:effectExtent l="0" t="0" r="2540" b="0"/>
             <wp:docPr id="745827728" name="Picture 53"/>
@@ -2330,9 +2532,8 @@
           <w:noProof/>
           <w:lang w:val="en-US"/>
         </w:rPr>
-        <w:lastRenderedPageBreak/>
         <w:drawing>
-          <wp:inline distT="0" distB="0" distL="0" distR="0" wp14:anchorId="2960F779" wp14:editId="6E0A4751">
+          <wp:inline distT="0" distB="0" distL="0" distR="0" wp14:anchorId="2960F779" wp14:editId="10A3D354">
             <wp:extent cx="5731510" cy="2865755"/>
             <wp:effectExtent l="0" t="0" r="2540" b="0"/>
             <wp:docPr id="54445383" name="Picture 54"/>
@@ -2379,7 +2580,7 @@
           <w:lang w:val="en-US"/>
         </w:rPr>
         <w:drawing>
-          <wp:inline distT="0" distB="0" distL="0" distR="0" wp14:anchorId="7FD95DAF" wp14:editId="2DE2BA1A">
+          <wp:inline distT="0" distB="0" distL="0" distR="0" wp14:anchorId="7FD95DAF" wp14:editId="70589046">
             <wp:extent cx="5731510" cy="2865755"/>
             <wp:effectExtent l="0" t="0" r="2540" b="0"/>
             <wp:docPr id="1416452972" name="Picture 55"/>
@@ -2425,8 +2626,9 @@
           <w:noProof/>
           <w:lang w:val="en-US"/>
         </w:rPr>
+        <w:lastRenderedPageBreak/>
         <w:drawing>
-          <wp:inline distT="0" distB="0" distL="0" distR="0" wp14:anchorId="0500D219" wp14:editId="313DE0B8">
+          <wp:inline distT="0" distB="0" distL="0" distR="0" wp14:anchorId="0500D219" wp14:editId="6C8974F3">
             <wp:extent cx="5731510" cy="2865755"/>
             <wp:effectExtent l="0" t="0" r="2540" b="0"/>
             <wp:docPr id="216711112" name="Picture 56"/>
@@ -2472,9 +2674,8 @@
           <w:noProof/>
           <w:lang w:val="en-US"/>
         </w:rPr>
-        <w:lastRenderedPageBreak/>
         <w:drawing>
-          <wp:inline distT="0" distB="0" distL="0" distR="0" wp14:anchorId="72A3744E" wp14:editId="76D70092">
+          <wp:inline distT="0" distB="0" distL="0" distR="0" wp14:anchorId="72A3744E" wp14:editId="6B45B6FA">
             <wp:extent cx="5731510" cy="2865755"/>
             <wp:effectExtent l="0" t="0" r="2540" b="0"/>
             <wp:docPr id="2109094938" name="Picture 57"/>
@@ -2521,7 +2722,7 @@
           <w:lang w:val="en-US"/>
         </w:rPr>
         <w:drawing>
-          <wp:inline distT="0" distB="0" distL="0" distR="0" wp14:anchorId="2E755AB0" wp14:editId="5DD95D23">
+          <wp:inline distT="0" distB="0" distL="0" distR="0" wp14:anchorId="2E755AB0" wp14:editId="14B47DAB">
             <wp:extent cx="5731510" cy="2865755"/>
             <wp:effectExtent l="0" t="0" r="2540" b="0"/>
             <wp:docPr id="1949299158" name="Picture 58"/>
@@ -2567,8 +2768,9 @@
           <w:noProof/>
           <w:lang w:val="en-US"/>
         </w:rPr>
+        <w:lastRenderedPageBreak/>
         <w:drawing>
-          <wp:inline distT="0" distB="0" distL="0" distR="0" wp14:anchorId="5C5094C7" wp14:editId="5B8D7BF5">
+          <wp:inline distT="0" distB="0" distL="0" distR="0" wp14:anchorId="5C5094C7" wp14:editId="36E1EFAC">
             <wp:extent cx="5731510" cy="2865755"/>
             <wp:effectExtent l="0" t="0" r="2540" b="0"/>
             <wp:docPr id="564425359" name="Picture 59"/>
@@ -2614,9 +2816,8 @@
           <w:noProof/>
           <w:lang w:val="en-US"/>
         </w:rPr>
-        <w:lastRenderedPageBreak/>
         <w:drawing>
-          <wp:inline distT="0" distB="0" distL="0" distR="0" wp14:anchorId="271D88CF" wp14:editId="2B579F78">
+          <wp:inline distT="0" distB="0" distL="0" distR="0" wp14:anchorId="271D88CF" wp14:editId="43733C6D">
             <wp:extent cx="5731510" cy="2865755"/>
             <wp:effectExtent l="0" t="0" r="2540" b="0"/>
             <wp:docPr id="1676182464" name="Picture 60"/>
@@ -2663,7 +2864,7 @@
           <w:lang w:val="en-US"/>
         </w:rPr>
         <w:drawing>
-          <wp:inline distT="0" distB="0" distL="0" distR="0" wp14:anchorId="096E04DB" wp14:editId="5046131A">
+          <wp:inline distT="0" distB="0" distL="0" distR="0" wp14:anchorId="096E04DB" wp14:editId="3D10AABF">
             <wp:extent cx="5731510" cy="2865755"/>
             <wp:effectExtent l="0" t="0" r="2540" b="0"/>
             <wp:docPr id="1543847480" name="Picture 61"/>
@@ -2709,8 +2910,9 @@
           <w:noProof/>
           <w:lang w:val="en-US"/>
         </w:rPr>
+        <w:lastRenderedPageBreak/>
         <w:drawing>
-          <wp:inline distT="0" distB="0" distL="0" distR="0" wp14:anchorId="096B9269" wp14:editId="5C0894EC">
+          <wp:inline distT="0" distB="0" distL="0" distR="0" wp14:anchorId="096B9269" wp14:editId="5861DAB8">
             <wp:extent cx="5731510" cy="2865755"/>
             <wp:effectExtent l="0" t="0" r="2540" b="0"/>
             <wp:docPr id="1881528154" name="Picture 62"/>
@@ -2756,9 +2958,8 @@
           <w:noProof/>
           <w:lang w:val="en-US"/>
         </w:rPr>
-        <w:lastRenderedPageBreak/>
         <w:drawing>
-          <wp:inline distT="0" distB="0" distL="0" distR="0" wp14:anchorId="4EC55314" wp14:editId="582D46F9">
+          <wp:inline distT="0" distB="0" distL="0" distR="0" wp14:anchorId="4EC55314" wp14:editId="63193061">
             <wp:extent cx="5731510" cy="2865755"/>
             <wp:effectExtent l="0" t="0" r="2540" b="0"/>
             <wp:docPr id="1615010103" name="Picture 63"/>
@@ -2805,7 +3006,7 @@
           <w:lang w:val="en-US"/>
         </w:rPr>
         <w:drawing>
-          <wp:inline distT="0" distB="0" distL="0" distR="0" wp14:anchorId="0811F657" wp14:editId="399D0749">
+          <wp:inline distT="0" distB="0" distL="0" distR="0" wp14:anchorId="0811F657" wp14:editId="635F890A">
             <wp:extent cx="5731510" cy="2865755"/>
             <wp:effectExtent l="0" t="0" r="2540" b="0"/>
             <wp:docPr id="14235863" name="Picture 64"/>
@@ -2851,8 +3052,9 @@
           <w:noProof/>
           <w:lang w:val="en-US"/>
         </w:rPr>
+        <w:lastRenderedPageBreak/>
         <w:drawing>
-          <wp:inline distT="0" distB="0" distL="0" distR="0" wp14:anchorId="3AD2F312" wp14:editId="717BE8C0">
+          <wp:inline distT="0" distB="0" distL="0" distR="0" wp14:anchorId="3AD2F312" wp14:editId="6A3737AB">
             <wp:extent cx="5731510" cy="2865755"/>
             <wp:effectExtent l="0" t="0" r="2540" b="0"/>
             <wp:docPr id="1878882340" name="Picture 65"/>
@@ -2898,9 +3100,8 @@
           <w:noProof/>
           <w:lang w:val="en-US"/>
         </w:rPr>
-        <w:lastRenderedPageBreak/>
         <w:drawing>
-          <wp:inline distT="0" distB="0" distL="0" distR="0" wp14:anchorId="07776482" wp14:editId="511A1A9D">
+          <wp:inline distT="0" distB="0" distL="0" distR="0" wp14:anchorId="07776482" wp14:editId="52A39FD3">
             <wp:extent cx="5731510" cy="2865755"/>
             <wp:effectExtent l="0" t="0" r="2540" b="0"/>
             <wp:docPr id="1247316937" name="Picture 66"/>
@@ -2946,8 +3147,9 @@
           <w:noProof/>
           <w:lang w:val="en-US"/>
         </w:rPr>
+        <w:lastRenderedPageBreak/>
         <w:drawing>
-          <wp:inline distT="0" distB="0" distL="0" distR="0" wp14:anchorId="413EAE66" wp14:editId="605251D4">
+          <wp:inline distT="0" distB="0" distL="0" distR="0" wp14:anchorId="413EAE66" wp14:editId="0A329C52">
             <wp:extent cx="5731510" cy="2865755"/>
             <wp:effectExtent l="0" t="0" r="2540" b="0"/>
             <wp:docPr id="113299463" name="Picture 67"/>
@@ -2994,7 +3196,7 @@
           <w:lang w:val="en-US"/>
         </w:rPr>
         <w:drawing>
-          <wp:inline distT="0" distB="0" distL="0" distR="0" wp14:anchorId="7CF9D390" wp14:editId="48903BC8">
+          <wp:inline distT="0" distB="0" distL="0" distR="0" wp14:anchorId="7CF9D390" wp14:editId="1D7770E4">
             <wp:extent cx="5731510" cy="2865755"/>
             <wp:effectExtent l="0" t="0" r="2540" b="0"/>
             <wp:docPr id="1437068316" name="Picture 68"/>
@@ -3117,7 +3319,11 @@
         <w:t xml:space="preserve">, </w:t>
       </w:r>
       <w:r>
-        <w:t xml:space="preserve">this near-total focus on the i-1 position suggests that this head functions as a near-perfect bigram detector. This indicates that the model's lowest hierarchy is dedicated to local character-to-character transition mapping before </w:t>
+        <w:t xml:space="preserve">this near-total focus on the i-1 position suggests that this head functions as a near-perfect bigram detector. This indicates that the model's lowest hierarchy is </w:t>
+      </w:r>
+      <w:r>
+        <w:lastRenderedPageBreak/>
+        <w:t xml:space="preserve">dedicated to local character-to-character transition mapping before </w:t>
       </w:r>
       <w:r>
         <w:rPr>
@@ -3218,7 +3424,6 @@
           <w:noProof/>
           <w:lang w:val="en-US"/>
         </w:rPr>
-        <w:lastRenderedPageBreak/>
         <w:drawing>
           <wp:inline distT="0" distB="0" distL="0" distR="0" wp14:anchorId="7A77CA34" wp14:editId="4B1C2359">
             <wp:extent cx="5731510" cy="2865755"/>
@@ -3278,7 +3483,11 @@
         <w:t>was higher</w:t>
       </w:r>
       <w:r>
-        <w:t xml:space="preserve"> in the later stages of the model. This trend strongly supports the 'local-to-global' hierarchy hypothesis. In the early layers, the model's attention budget is primarily dedicated to local feature extraction and character-level transition mapping (as seen in the Layer 0 bigram detector). By the mid-to-late layers (specifically Layer 4), the model transitions toward global sequence management. By this stage, local</w:t>
+        <w:t xml:space="preserve"> in </w:t>
+      </w:r>
+      <w:r>
+        <w:lastRenderedPageBreak/>
+        <w:t>the later stages of the model. This trend strongly supports the 'local-to-global' hierarchy hypothesis. In the early layers, the model's attention budget is primarily dedicated to local feature extraction and character-level transition mapping (as seen in the Layer 0 bigram detector). By the mid-to-late layers (specifically Layer 4), the model transitions toward global sequence management. By this stage, local</w:t>
       </w:r>
       <w:proofErr w:type="spellStart"/>
       <w:r>
@@ -3329,7 +3538,6 @@
           <w:noProof/>
           <w:lang w:val="en-US"/>
         </w:rPr>
-        <w:lastRenderedPageBreak/>
         <w:drawing>
           <wp:inline distT="0" distB="0" distL="0" distR="0" wp14:anchorId="48DE193E" wp14:editId="5DB1584B">
             <wp:extent cx="5731510" cy="2865755"/>
@@ -3424,6 +3632,7 @@
           <w:noProof/>
           <w:lang w:val="en-US"/>
         </w:rPr>
+        <w:lastRenderedPageBreak/>
         <w:drawing>
           <wp:inline distT="0" distB="0" distL="0" distR="0" wp14:anchorId="7ED9C532" wp14:editId="3CFE9852">
             <wp:extent cx="5731510" cy="2865755"/>
@@ -3471,7 +3680,6 @@
           <w:noProof/>
           <w:lang w:val="en-US"/>
         </w:rPr>
-        <w:lastRenderedPageBreak/>
         <w:drawing>
           <wp:inline distT="0" distB="0" distL="0" distR="0" wp14:anchorId="007A8417" wp14:editId="71033C3E">
             <wp:extent cx="5731510" cy="2865755"/>
@@ -3519,6 +3727,7 @@
           <w:noProof/>
           <w:lang w:val="en-US"/>
         </w:rPr>
+        <w:lastRenderedPageBreak/>
         <w:drawing>
           <wp:inline distT="0" distB="0" distL="0" distR="0" wp14:anchorId="48159F48" wp14:editId="2389B587">
             <wp:extent cx="5731510" cy="2865755"/>
@@ -3623,31 +3832,31 @@
           <w:bCs/>
           <w:lang w:val="en-US"/>
         </w:rPr>
+        <w:t>Additional Behavioral Tests</w:t>
+      </w:r>
+    </w:p>
+    <w:p>
+      <w:pPr>
+        <w:rPr>
+          <w:lang w:val="en-US"/>
+        </w:rPr>
+      </w:pPr>
+      <w:r>
+        <w:t xml:space="preserve">To investigate whether the model utilizes 'induction circuits' to handle repetitive structures, we tested its attention response to repeated word sequences (e.g., 'apple apple'). We specifically analyzed whether tokens in the second instance of a word would attend to their corresponding predecessors in the first instance. The results were inconclusive, with average attention scores failing to exceed 0.2 across all layers. </w:t>
+      </w:r>
+    </w:p>
+    <w:p>
+      <w:pPr>
+        <w:rPr>
+          <w:lang w:val="en-US"/>
+        </w:rPr>
+      </w:pPr>
+      <w:r>
+        <w:rPr>
+          <w:noProof/>
+          <w:lang w:val="en-US"/>
+        </w:rPr>
         <w:lastRenderedPageBreak/>
-        <w:t>Additional Behavioral Tests</w:t>
-      </w:r>
-    </w:p>
-    <w:p>
-      <w:pPr>
-        <w:rPr>
-          <w:lang w:val="en-US"/>
-        </w:rPr>
-      </w:pPr>
-      <w:r>
-        <w:t xml:space="preserve">To investigate whether the model utilizes 'induction circuits' to handle repetitive structures, we tested its attention response to repeated word sequences (e.g., 'apple apple'). We specifically analyzed whether tokens in the second instance of a word would attend to their corresponding predecessors in the first instance. The results were inconclusive, with average attention scores failing to exceed 0.2 across all layers. </w:t>
-      </w:r>
-    </w:p>
-    <w:p>
-      <w:pPr>
-        <w:rPr>
-          <w:lang w:val="en-US"/>
-        </w:rPr>
-      </w:pPr>
-      <w:r>
-        <w:rPr>
-          <w:noProof/>
-          <w:lang w:val="en-US"/>
-        </w:rPr>
         <w:drawing>
           <wp:inline distT="0" distB="0" distL="0" distR="0" wp14:anchorId="68E99CF0" wp14:editId="39CF230D">
             <wp:extent cx="5731510" cy="2865755"/>
@@ -3742,7 +3951,6 @@
           <w:noProof/>
           <w:lang w:val="en-US"/>
         </w:rPr>
-        <w:lastRenderedPageBreak/>
         <w:drawing>
           <wp:inline distT="0" distB="0" distL="0" distR="0" wp14:anchorId="04911369" wp14:editId="433CBF92">
             <wp:extent cx="5731510" cy="2865755"/>
@@ -3790,6 +3998,7 @@
           <w:noProof/>
           <w:lang w:val="en-US"/>
         </w:rPr>
+        <w:lastRenderedPageBreak/>
         <w:drawing>
           <wp:inline distT="0" distB="0" distL="0" distR="0" wp14:anchorId="61B23062" wp14:editId="40FDCADA">
             <wp:extent cx="5731510" cy="2865755"/>
@@ -4582,10 +4791,1424 @@
     </w:p>
     <w:p>
       <w:pPr>
-        <w:rPr>
-          <w:noProof/>
-        </w:rPr>
-      </w:pPr>
+        <w:pStyle w:val="Heading1"/>
+        <w:rPr>
+          <w:noProof/>
+          <w:lang w:val="en-US"/>
+        </w:rPr>
+      </w:pPr>
+      <w:r>
+        <w:rPr>
+          <w:noProof/>
+          <w:lang w:val="en-US"/>
+        </w:rPr>
+        <w:t>Note on the Models included in Submission</w:t>
+      </w:r>
+    </w:p>
+    <w:p>
+      <w:pPr>
+        <w:rPr>
+          <w:b/>
+          <w:bCs/>
+          <w:lang w:val="en-US"/>
+        </w:rPr>
+      </w:pPr>
+      <w:r>
+        <w:rPr>
+          <w:b/>
+          <w:bCs/>
+        </w:rPr>
+        <w:t>1. Final Models (Full Dataset)</w:t>
+      </w:r>
+    </w:p>
+    <w:p>
+      <w:r>
+        <w:t>These checkpoints represent the models trained on the entire dataset for 50,000 batches.</w:t>
+      </w:r>
+    </w:p>
+    <w:p>
+      <w:r>
+        <w:rPr>
+          <w:b/>
+          <w:bCs/>
+        </w:rPr>
+        <w:t>File Paths:</w:t>
+      </w:r>
+    </w:p>
+    <w:p>
+      <w:pPr>
+        <w:numPr>
+          <w:ilvl w:val="0"/>
+          <w:numId w:val="12"/>
+        </w:numPr>
+      </w:pPr>
+      <w:r>
+        <w:t>new_checkpoints/en/checkpoint_efficient=True_50000.pt</w:t>
+      </w:r>
+    </w:p>
+    <w:p>
+      <w:pPr>
+        <w:numPr>
+          <w:ilvl w:val="0"/>
+          <w:numId w:val="12"/>
+        </w:numPr>
+      </w:pPr>
+      <w:r>
+        <w:t>new_checkpoints/he/checkpoint_efficient=True_50000.pt</w:t>
+      </w:r>
+    </w:p>
+    <w:p>
+      <w:r>
+        <w:rPr>
+          <w:b/>
+          <w:bCs/>
+        </w:rPr>
+        <w:lastRenderedPageBreak/>
+        <w:t>Initialization Parameters:</w:t>
+      </w:r>
+      <w:r>
+        <w:t xml:space="preserve"> The model must be initialized with the following fixed configuration:</w:t>
+      </w:r>
+    </w:p>
+    <w:p>
+      <w:pPr>
+        <w:numPr>
+          <w:ilvl w:val="0"/>
+          <w:numId w:val="13"/>
+        </w:numPr>
+      </w:pPr>
+      <w:r>
+        <w:t>n_layers = 8</w:t>
+      </w:r>
+    </w:p>
+    <w:p>
+      <w:pPr>
+        <w:numPr>
+          <w:ilvl w:val="0"/>
+          <w:numId w:val="13"/>
+        </w:numPr>
+      </w:pPr>
+      <w:r>
+        <w:t>embed_size = 256</w:t>
+      </w:r>
+    </w:p>
+    <w:p>
+      <w:pPr>
+        <w:numPr>
+          <w:ilvl w:val="0"/>
+          <w:numId w:val="13"/>
+        </w:numPr>
+      </w:pPr>
+      <w:r>
+        <w:t>max_context_len = 128</w:t>
+      </w:r>
+    </w:p>
+    <w:p>
+      <w:pPr>
+        <w:numPr>
+          <w:ilvl w:val="0"/>
+          <w:numId w:val="13"/>
+        </w:numPr>
+      </w:pPr>
+      <w:r>
+        <w:t>with_residuals = True</w:t>
+      </w:r>
+    </w:p>
+    <w:p>
+      <w:pPr>
+        <w:numPr>
+          <w:ilvl w:val="0"/>
+          <w:numId w:val="13"/>
+        </w:numPr>
+      </w:pPr>
+      <w:r>
+        <w:t>efficient = True</w:t>
+      </w:r>
+    </w:p>
+    <w:p>
+      <w:r>
+        <w:rPr>
+          <w:b/>
+          <w:bCs/>
+        </w:rPr>
+        <w:t>Internal Dictionary Structure:</w:t>
+      </w:r>
+    </w:p>
+    <w:p>
+      <w:pPr>
+        <w:rPr>
+          <w:lang w:val="en-US"/>
+        </w:rPr>
+      </w:pPr>
+      <w:r>
+        <w:rPr>
+          <w:lang w:val="en-US"/>
+        </w:rPr>
+        <w:t>{</w:t>
+      </w:r>
+    </w:p>
+    <w:p>
+      <w:pPr>
+        <w:rPr>
+          <w:lang w:val="en-US"/>
+        </w:rPr>
+      </w:pPr>
+      <w:r>
+        <w:rPr>
+          <w:lang w:val="en-US"/>
+        </w:rPr>
+        <w:t xml:space="preserve">    "</w:t>
+      </w:r>
+      <w:proofErr w:type="spellStart"/>
+      <w:r>
+        <w:rPr>
+          <w:lang w:val="en-US"/>
+        </w:rPr>
+        <w:t>model_state_dict</w:t>
+      </w:r>
+      <w:proofErr w:type="spellEnd"/>
+      <w:r>
+        <w:rPr>
+          <w:lang w:val="en-US"/>
+        </w:rPr>
+        <w:t xml:space="preserve">": </w:t>
+      </w:r>
+      <w:proofErr w:type="spellStart"/>
+      <w:r>
+        <w:rPr>
+          <w:lang w:val="en-US"/>
+        </w:rPr>
+        <w:t>model.state_dict</w:t>
+      </w:r>
+      <w:proofErr w:type="spellEnd"/>
+      <w:r>
+        <w:rPr>
+          <w:lang w:val="en-US"/>
+        </w:rPr>
+        <w:t>(),</w:t>
+      </w:r>
+    </w:p>
+    <w:p>
+      <w:pPr>
+        <w:rPr>
+          <w:lang w:val="en-US"/>
+        </w:rPr>
+      </w:pPr>
+      <w:r>
+        <w:rPr>
+          <w:lang w:val="en-US"/>
+        </w:rPr>
+        <w:t xml:space="preserve">    "</w:t>
+      </w:r>
+      <w:proofErr w:type="spellStart"/>
+      <w:r>
+        <w:rPr>
+          <w:lang w:val="en-US"/>
+        </w:rPr>
+        <w:t>optimizer_state_dict</w:t>
+      </w:r>
+      <w:proofErr w:type="spellEnd"/>
+      <w:r>
+        <w:rPr>
+          <w:lang w:val="en-US"/>
+        </w:rPr>
+        <w:t xml:space="preserve">": </w:t>
+      </w:r>
+      <w:proofErr w:type="spellStart"/>
+      <w:r>
+        <w:rPr>
+          <w:lang w:val="en-US"/>
+        </w:rPr>
+        <w:t>optimizer.state_dict</w:t>
+      </w:r>
+      <w:proofErr w:type="spellEnd"/>
+      <w:r>
+        <w:rPr>
+          <w:lang w:val="en-US"/>
+        </w:rPr>
+        <w:t>(),</w:t>
+      </w:r>
+    </w:p>
+    <w:p>
+      <w:pPr>
+        <w:rPr>
+          <w:lang w:val="en-US"/>
+        </w:rPr>
+      </w:pPr>
+      <w:r>
+        <w:rPr>
+          <w:lang w:val="en-US"/>
+        </w:rPr>
+        <w:t xml:space="preserve">    "</w:t>
+      </w:r>
+      <w:proofErr w:type="spellStart"/>
+      <w:r>
+        <w:rPr>
+          <w:lang w:val="en-US"/>
+        </w:rPr>
+        <w:t>num_batches</w:t>
+      </w:r>
+      <w:proofErr w:type="spellEnd"/>
+      <w:r>
+        <w:rPr>
+          <w:lang w:val="en-US"/>
+        </w:rPr>
+        <w:t xml:space="preserve">": </w:t>
+      </w:r>
+      <w:proofErr w:type="spellStart"/>
+      <w:r>
+        <w:rPr>
+          <w:lang w:val="en-US"/>
+        </w:rPr>
+        <w:t>num_batches</w:t>
+      </w:r>
+      <w:proofErr w:type="spellEnd"/>
+      <w:r>
+        <w:rPr>
+          <w:lang w:val="en-US"/>
+        </w:rPr>
+        <w:t>,</w:t>
+      </w:r>
+    </w:p>
+    <w:p>
+      <w:pPr>
+        <w:rPr>
+          <w:lang w:val="en-US"/>
+        </w:rPr>
+      </w:pPr>
+      <w:r>
+        <w:rPr>
+          <w:lang w:val="en-US"/>
+        </w:rPr>
+        <w:t xml:space="preserve">    "loss": </w:t>
+      </w:r>
+      <w:proofErr w:type="spellStart"/>
+      <w:r>
+        <w:rPr>
+          <w:lang w:val="en-US"/>
+        </w:rPr>
+        <w:t>loss.item</w:t>
+      </w:r>
+      <w:proofErr w:type="spellEnd"/>
+      <w:r>
+        <w:rPr>
+          <w:lang w:val="en-US"/>
+        </w:rPr>
+        <w:t>()</w:t>
+      </w:r>
+    </w:p>
+    <w:p>
+      <w:pPr>
+        <w:rPr>
+          <w:lang w:val="en-US"/>
+        </w:rPr>
+      </w:pPr>
+      <w:r>
+        <w:rPr>
+          <w:lang w:val="en-US"/>
+        </w:rPr>
+        <w:t>}</w:t>
+      </w:r>
+    </w:p>
+    <w:p>
+      <w:pPr>
+        <w:rPr>
+          <w:b/>
+          <w:bCs/>
+        </w:rPr>
+      </w:pPr>
+      <w:r>
+        <w:rPr>
+          <w:b/>
+          <w:bCs/>
+          <w:lang w:val="en-US"/>
+        </w:rPr>
+        <w:t>2</w:t>
+      </w:r>
+      <w:r>
+        <w:rPr>
+          <w:b/>
+          <w:bCs/>
+        </w:rPr>
+        <w:t xml:space="preserve">. Best </w:t>
+      </w:r>
+      <w:r>
+        <w:rPr>
+          <w:b/>
+          <w:bCs/>
+          <w:lang w:val="en-US"/>
+        </w:rPr>
+        <w:t>Training/</w:t>
+      </w:r>
+      <w:r>
+        <w:rPr>
+          <w:b/>
+          <w:bCs/>
+        </w:rPr>
+        <w:t>Validation</w:t>
+      </w:r>
+      <w:r>
+        <w:rPr>
+          <w:b/>
+          <w:bCs/>
+          <w:lang w:val="en-US"/>
+        </w:rPr>
+        <w:t xml:space="preserve"> Split</w:t>
+      </w:r>
+      <w:r>
+        <w:rPr>
+          <w:b/>
+          <w:bCs/>
+        </w:rPr>
+        <w:t xml:space="preserve"> Models (Random Search)</w:t>
+      </w:r>
+    </w:p>
+    <w:p>
+      <w:r>
+        <w:t>These represent the optimal hyperparameter configurations found during the random search phase, selected based on the best (lowest) validation loss.</w:t>
+      </w:r>
+    </w:p>
+    <w:p>
+      <w:r>
+        <w:rPr>
+          <w:b/>
+          <w:bCs/>
+        </w:rPr>
+        <w:t>File Paths:</w:t>
+      </w:r>
+    </w:p>
+    <w:p>
+      <w:pPr>
+        <w:numPr>
+          <w:ilvl w:val="0"/>
+          <w:numId w:val="14"/>
+        </w:numPr>
+      </w:pPr>
+      <w:r>
+        <w:rPr>
+          <w:b/>
+          <w:bCs/>
+        </w:rPr>
+        <w:t>English:</w:t>
+      </w:r>
+      <w:r>
+        <w:t xml:space="preserve"> validation_checkpoints_random_search/en/best_en_efficient=True_seq128_layers8_heads8_embed256_mlp1024_lr0.00046087_wd0.037913.pt</w:t>
+      </w:r>
+    </w:p>
+    <w:p>
+      <w:pPr>
+        <w:numPr>
+          <w:ilvl w:val="0"/>
+          <w:numId w:val="14"/>
+        </w:numPr>
+      </w:pPr>
+      <w:r>
+        <w:rPr>
+          <w:b/>
+          <w:bCs/>
+        </w:rPr>
+        <w:t>Hebrew:</w:t>
+      </w:r>
+      <w:r>
+        <w:t xml:space="preserve"> validation_checkpoints_random_search/he/best_he_efficient=True_seq128_layers8_heads6_embed192_mlp768_lr0.00021274_wd0.078022</w:t>
+      </w:r>
+    </w:p>
+    <w:p>
+      <w:r>
+        <w:rPr>
+          <w:b/>
+          <w:bCs/>
+        </w:rPr>
+        <w:t>Initialization:</w:t>
+      </w:r>
+      <w:r>
+        <w:t xml:space="preserve"> Initialize using residuals = True and efficient = True. All other architectural parameters must be pulled directly from the hyperparams dictionary within the file.</w:t>
+      </w:r>
+    </w:p>
+    <w:p>
+      <w:r>
+        <w:rPr>
+          <w:b/>
+          <w:bCs/>
+        </w:rPr>
+        <w:t>Internal Dictionary Structure:</w:t>
+      </w:r>
+    </w:p>
+    <w:p>
+      <w:pPr>
+        <w:rPr>
+          <w:lang w:val="en-US"/>
+        </w:rPr>
+      </w:pPr>
+      <w:r>
+        <w:rPr>
+          <w:lang w:val="en-US"/>
+        </w:rPr>
+        <w:t>{</w:t>
+      </w:r>
+    </w:p>
+    <w:p>
+      <w:pPr>
+        <w:rPr>
+          <w:lang w:val="en-US"/>
+        </w:rPr>
+      </w:pPr>
+      <w:r>
+        <w:rPr>
+          <w:lang w:val="en-US"/>
+        </w:rPr>
+        <w:t xml:space="preserve">  "</w:t>
+      </w:r>
+      <w:proofErr w:type="spellStart"/>
+      <w:r>
+        <w:rPr>
+          <w:lang w:val="en-US"/>
+        </w:rPr>
+        <w:t>model_state_dict</w:t>
+      </w:r>
+      <w:proofErr w:type="spellEnd"/>
+      <w:r>
+        <w:rPr>
+          <w:lang w:val="en-US"/>
+        </w:rPr>
+        <w:t>": ...,</w:t>
+      </w:r>
+    </w:p>
+    <w:p>
+      <w:pPr>
+        <w:rPr>
+          <w:lang w:val="en-US"/>
+        </w:rPr>
+      </w:pPr>
+      <w:r>
+        <w:rPr>
+          <w:lang w:val="en-US"/>
+        </w:rPr>
+        <w:t xml:space="preserve">  "</w:t>
+      </w:r>
+      <w:proofErr w:type="spellStart"/>
+      <w:r>
+        <w:rPr>
+          <w:lang w:val="en-US"/>
+        </w:rPr>
+        <w:t>optimizer_state_dict</w:t>
+      </w:r>
+      <w:proofErr w:type="spellEnd"/>
+      <w:r>
+        <w:rPr>
+          <w:lang w:val="en-US"/>
+        </w:rPr>
+        <w:t>": ...,</w:t>
+      </w:r>
+    </w:p>
+    <w:p>
+      <w:pPr>
+        <w:rPr>
+          <w:lang w:val="en-US"/>
+        </w:rPr>
+      </w:pPr>
+      <w:r>
+        <w:rPr>
+          <w:lang w:val="en-US"/>
+        </w:rPr>
+        <w:t xml:space="preserve">  "</w:t>
+      </w:r>
+      <w:proofErr w:type="spellStart"/>
+      <w:r>
+        <w:rPr>
+          <w:lang w:val="en-US"/>
+        </w:rPr>
+        <w:t>num_batches</w:t>
+      </w:r>
+      <w:proofErr w:type="spellEnd"/>
+      <w:r>
+        <w:rPr>
+          <w:lang w:val="en-US"/>
+        </w:rPr>
+        <w:t>": int,</w:t>
+      </w:r>
+    </w:p>
+    <w:p>
+      <w:pPr>
+        <w:rPr>
+          <w:lang w:val="en-US"/>
+        </w:rPr>
+      </w:pPr>
+      <w:r>
+        <w:rPr>
+          <w:lang w:val="en-US"/>
+        </w:rPr>
+        <w:t xml:space="preserve">  "</w:t>
+      </w:r>
+      <w:proofErr w:type="spellStart"/>
+      <w:r>
+        <w:rPr>
+          <w:lang w:val="en-US"/>
+        </w:rPr>
+        <w:t>train_loss</w:t>
+      </w:r>
+      <w:proofErr w:type="spellEnd"/>
+      <w:r>
+        <w:rPr>
+          <w:lang w:val="en-US"/>
+        </w:rPr>
+        <w:t>": float,          # Train loss at best validation point</w:t>
+      </w:r>
+    </w:p>
+    <w:p>
+      <w:pPr>
+        <w:rPr>
+          <w:lang w:val="en-US"/>
+        </w:rPr>
+      </w:pPr>
+      <w:r>
+        <w:rPr>
+          <w:lang w:val="en-US"/>
+        </w:rPr>
+        <w:t xml:space="preserve">  "</w:t>
+      </w:r>
+      <w:proofErr w:type="spellStart"/>
+      <w:r>
+        <w:rPr>
+          <w:lang w:val="en-US"/>
+        </w:rPr>
+        <w:t>validation_loss</w:t>
+      </w:r>
+      <w:proofErr w:type="spellEnd"/>
+      <w:r>
+        <w:rPr>
+          <w:lang w:val="en-US"/>
+        </w:rPr>
+        <w:t>": float,     # Validation loss at that point</w:t>
+      </w:r>
+    </w:p>
+    <w:p>
+      <w:pPr>
+        <w:rPr>
+          <w:lang w:val="en-US"/>
+        </w:rPr>
+      </w:pPr>
+      <w:r>
+        <w:rPr>
+          <w:lang w:val="en-US"/>
+        </w:rPr>
+        <w:t xml:space="preserve">  "</w:t>
+      </w:r>
+      <w:proofErr w:type="spellStart"/>
+      <w:r>
+        <w:rPr>
+          <w:lang w:val="en-US"/>
+        </w:rPr>
+        <w:t>best_validation_loss</w:t>
+      </w:r>
+      <w:proofErr w:type="spellEnd"/>
+      <w:r>
+        <w:rPr>
+          <w:lang w:val="en-US"/>
+        </w:rPr>
+        <w:t>": float, # The lowest loss achieved in the trial</w:t>
+      </w:r>
+    </w:p>
+    <w:p>
+      <w:pPr>
+        <w:rPr>
+          <w:lang w:val="en-US"/>
+        </w:rPr>
+      </w:pPr>
+      <w:r>
+        <w:rPr>
+          <w:lang w:val="en-US"/>
+        </w:rPr>
+        <w:lastRenderedPageBreak/>
+        <w:t xml:space="preserve">  "</w:t>
+      </w:r>
+      <w:proofErr w:type="spellStart"/>
+      <w:r>
+        <w:rPr>
+          <w:lang w:val="en-US"/>
+        </w:rPr>
+        <w:t>hyperparams</w:t>
+      </w:r>
+      <w:proofErr w:type="spellEnd"/>
+      <w:r>
+        <w:rPr>
+          <w:lang w:val="en-US"/>
+        </w:rPr>
+        <w:t>": {</w:t>
+      </w:r>
+    </w:p>
+    <w:p>
+      <w:pPr>
+        <w:rPr>
+          <w:lang w:val="en-US"/>
+        </w:rPr>
+      </w:pPr>
+      <w:r>
+        <w:rPr>
+          <w:lang w:val="en-US"/>
+        </w:rPr>
+        <w:t xml:space="preserve">    "</w:t>
+      </w:r>
+      <w:proofErr w:type="spellStart"/>
+      <w:r>
+        <w:rPr>
+          <w:lang w:val="en-US"/>
+        </w:rPr>
+        <w:t>seq_len</w:t>
+      </w:r>
+      <w:proofErr w:type="spellEnd"/>
+      <w:r>
+        <w:rPr>
+          <w:lang w:val="en-US"/>
+        </w:rPr>
+        <w:t>": int,</w:t>
+      </w:r>
+    </w:p>
+    <w:p>
+      <w:pPr>
+        <w:rPr>
+          <w:lang w:val="en-US"/>
+        </w:rPr>
+      </w:pPr>
+      <w:r>
+        <w:rPr>
+          <w:lang w:val="en-US"/>
+        </w:rPr>
+        <w:t xml:space="preserve">    "</w:t>
+      </w:r>
+      <w:proofErr w:type="spellStart"/>
+      <w:r>
+        <w:rPr>
+          <w:lang w:val="en-US"/>
+        </w:rPr>
+        <w:t>n_layers</w:t>
+      </w:r>
+      <w:proofErr w:type="spellEnd"/>
+      <w:r>
+        <w:rPr>
+          <w:lang w:val="en-US"/>
+        </w:rPr>
+        <w:t>": int,</w:t>
+      </w:r>
+    </w:p>
+    <w:p>
+      <w:pPr>
+        <w:rPr>
+          <w:lang w:val="en-US"/>
+        </w:rPr>
+      </w:pPr>
+      <w:r>
+        <w:rPr>
+          <w:lang w:val="en-US"/>
+        </w:rPr>
+        <w:t xml:space="preserve">    "</w:t>
+      </w:r>
+      <w:proofErr w:type="spellStart"/>
+      <w:r>
+        <w:rPr>
+          <w:lang w:val="en-US"/>
+        </w:rPr>
+        <w:t>n_heads</w:t>
+      </w:r>
+      <w:proofErr w:type="spellEnd"/>
+      <w:r>
+        <w:rPr>
+          <w:lang w:val="en-US"/>
+        </w:rPr>
+        <w:t>": int,</w:t>
+      </w:r>
+    </w:p>
+    <w:p>
+      <w:pPr>
+        <w:rPr>
+          <w:lang w:val="en-US"/>
+        </w:rPr>
+      </w:pPr>
+      <w:r>
+        <w:rPr>
+          <w:lang w:val="en-US"/>
+        </w:rPr>
+        <w:t xml:space="preserve">    "</w:t>
+      </w:r>
+      <w:proofErr w:type="spellStart"/>
+      <w:r>
+        <w:rPr>
+          <w:lang w:val="en-US"/>
+        </w:rPr>
+        <w:t>embed_size</w:t>
+      </w:r>
+      <w:proofErr w:type="spellEnd"/>
+      <w:r>
+        <w:rPr>
+          <w:lang w:val="en-US"/>
+        </w:rPr>
+        <w:t>": int,</w:t>
+      </w:r>
+    </w:p>
+    <w:p>
+      <w:pPr>
+        <w:rPr>
+          <w:lang w:val="en-US"/>
+        </w:rPr>
+      </w:pPr>
+      <w:r>
+        <w:rPr>
+          <w:lang w:val="en-US"/>
+        </w:rPr>
+        <w:t xml:space="preserve">    "</w:t>
+      </w:r>
+      <w:proofErr w:type="spellStart"/>
+      <w:r>
+        <w:rPr>
+          <w:lang w:val="en-US"/>
+        </w:rPr>
+        <w:t>mlp_hidden_size</w:t>
+      </w:r>
+      <w:proofErr w:type="spellEnd"/>
+      <w:r>
+        <w:rPr>
+          <w:lang w:val="en-US"/>
+        </w:rPr>
+        <w:t>": int,</w:t>
+      </w:r>
+    </w:p>
+    <w:p>
+      <w:pPr>
+        <w:rPr>
+          <w:lang w:val="en-US"/>
+        </w:rPr>
+      </w:pPr>
+      <w:r>
+        <w:rPr>
+          <w:lang w:val="en-US"/>
+        </w:rPr>
+        <w:t xml:space="preserve">    "</w:t>
+      </w:r>
+      <w:proofErr w:type="spellStart"/>
+      <w:r>
+        <w:rPr>
+          <w:lang w:val="en-US"/>
+        </w:rPr>
+        <w:t>learning_rate</w:t>
+      </w:r>
+      <w:proofErr w:type="spellEnd"/>
+      <w:r>
+        <w:rPr>
+          <w:lang w:val="en-US"/>
+        </w:rPr>
+        <w:t>": float,</w:t>
+      </w:r>
+    </w:p>
+    <w:p>
+      <w:pPr>
+        <w:rPr>
+          <w:lang w:val="en-US"/>
+        </w:rPr>
+      </w:pPr>
+      <w:r>
+        <w:rPr>
+          <w:lang w:val="en-US"/>
+        </w:rPr>
+        <w:t xml:space="preserve">    "</w:t>
+      </w:r>
+      <w:proofErr w:type="spellStart"/>
+      <w:r>
+        <w:rPr>
+          <w:lang w:val="en-US"/>
+        </w:rPr>
+        <w:t>weight_decay</w:t>
+      </w:r>
+      <w:proofErr w:type="spellEnd"/>
+      <w:r>
+        <w:rPr>
+          <w:lang w:val="en-US"/>
+        </w:rPr>
+        <w:t>": float</w:t>
+      </w:r>
+    </w:p>
+    <w:p>
+      <w:pPr>
+        <w:rPr>
+          <w:lang w:val="en-US"/>
+        </w:rPr>
+      </w:pPr>
+      <w:r>
+        <w:rPr>
+          <w:lang w:val="en-US"/>
+        </w:rPr>
+        <w:t xml:space="preserve">  },</w:t>
+      </w:r>
+    </w:p>
+    <w:p>
+      <w:pPr>
+        <w:rPr>
+          <w:lang w:val="en-US"/>
+        </w:rPr>
+      </w:pPr>
+      <w:r>
+        <w:rPr>
+          <w:lang w:val="en-US"/>
+        </w:rPr>
+        <w:t xml:space="preserve">  "</w:t>
+      </w:r>
+      <w:proofErr w:type="spellStart"/>
+      <w:r>
+        <w:rPr>
+          <w:lang w:val="en-US"/>
+        </w:rPr>
+        <w:t>trial_index</w:t>
+      </w:r>
+      <w:proofErr w:type="spellEnd"/>
+      <w:r>
+        <w:rPr>
+          <w:lang w:val="en-US"/>
+        </w:rPr>
+        <w:t>": int</w:t>
+      </w:r>
+    </w:p>
+    <w:p>
+      <w:pPr>
+        <w:rPr>
+          <w:lang w:val="en-US"/>
+        </w:rPr>
+      </w:pPr>
+      <w:r>
+        <w:rPr>
+          <w:lang w:val="en-US"/>
+        </w:rPr>
+        <w:t>}</w:t>
+      </w:r>
+    </w:p>
+    <w:p>
+      <w:pPr>
+        <w:rPr>
+          <w:b/>
+          <w:bCs/>
+        </w:rPr>
+      </w:pPr>
+      <w:r>
+        <w:rPr>
+          <w:b/>
+          <w:bCs/>
+        </w:rPr>
+        <w:t>3. Overfit Trigger Models</w:t>
+      </w:r>
+    </w:p>
+    <w:p>
+      <w:r>
+        <w:t>These checkpoints were saved at the specific moment the training process met the overfit stopping condition.</w:t>
+      </w:r>
+    </w:p>
+    <w:p>
+      <w:r>
+        <w:rPr>
+          <w:b/>
+          <w:bCs/>
+        </w:rPr>
+        <w:t>File Paths:</w:t>
+      </w:r>
+    </w:p>
+    <w:p>
+      <w:pPr>
+        <w:numPr>
+          <w:ilvl w:val="0"/>
+          <w:numId w:val="16"/>
+        </w:numPr>
+      </w:pPr>
+      <w:r>
+        <w:rPr>
+          <w:b/>
+          <w:bCs/>
+        </w:rPr>
+        <w:t>English:</w:t>
+      </w:r>
+      <w:r>
+        <w:t xml:space="preserve"> validation_checkpoints_random_search/en/trial_6_overfit_en_efficient=True</w:t>
+      </w:r>
+    </w:p>
+    <w:p>
+      <w:pPr>
+        <w:numPr>
+          <w:ilvl w:val="0"/>
+          <w:numId w:val="16"/>
+        </w:numPr>
+      </w:pPr>
+      <w:r>
+        <w:rPr>
+          <w:b/>
+          <w:bCs/>
+        </w:rPr>
+        <w:t>Hebrew:</w:t>
+      </w:r>
+      <w:r>
+        <w:t xml:space="preserve"> validation_checkpoints_random_search/he/trial_4_overfit_he_efficient=True</w:t>
+      </w:r>
+    </w:p>
+    <w:p>
+      <w:r>
+        <w:rPr>
+          <w:b/>
+          <w:bCs/>
+        </w:rPr>
+        <w:t>Initialization:</w:t>
+      </w:r>
+      <w:r>
+        <w:t xml:space="preserve"> Initialize with </w:t>
+      </w:r>
+      <w:r>
+        <w:rPr>
+          <w:b/>
+          <w:bCs/>
+        </w:rPr>
+        <w:t>residuals = True</w:t>
+      </w:r>
+      <w:r>
+        <w:t xml:space="preserve"> and </w:t>
+      </w:r>
+      <w:r>
+        <w:rPr>
+          <w:b/>
+          <w:bCs/>
+        </w:rPr>
+        <w:t>efficient = True</w:t>
+      </w:r>
+      <w:r>
+        <w:t>. All other architectural parameters must be passed from the internal hyperparams dictionary.</w:t>
+      </w:r>
+    </w:p>
+    <w:p>
+      <w:pPr>
+        <w:rPr>
+          <w:b/>
+          <w:bCs/>
+          <w:lang w:val="en-US"/>
+        </w:rPr>
+      </w:pPr>
+      <w:r>
+        <w:rPr>
+          <w:b/>
+          <w:bCs/>
+        </w:rPr>
+        <w:t>File Structure:</w:t>
+      </w:r>
+    </w:p>
+    <w:p>
+      <w:pPr>
+        <w:rPr>
+          <w:lang w:val="en-US"/>
+        </w:rPr>
+      </w:pPr>
+      <w:r>
+        <w:rPr>
+          <w:lang w:val="en-US"/>
+        </w:rPr>
+        <w:t>{</w:t>
+      </w:r>
+    </w:p>
+    <w:p>
+      <w:pPr>
+        <w:rPr>
+          <w:lang w:val="en-US"/>
+        </w:rPr>
+      </w:pPr>
+      <w:r>
+        <w:rPr>
+          <w:lang w:val="en-US"/>
+        </w:rPr>
+        <w:t xml:space="preserve">  "</w:t>
+      </w:r>
+      <w:proofErr w:type="spellStart"/>
+      <w:r>
+        <w:rPr>
+          <w:lang w:val="en-US"/>
+        </w:rPr>
+        <w:t>model_state_dict</w:t>
+      </w:r>
+      <w:proofErr w:type="spellEnd"/>
+      <w:r>
+        <w:rPr>
+          <w:lang w:val="en-US"/>
+        </w:rPr>
+        <w:t>": ...,</w:t>
+      </w:r>
+    </w:p>
+    <w:p>
+      <w:pPr>
+        <w:rPr>
+          <w:lang w:val="en-US"/>
+        </w:rPr>
+      </w:pPr>
+      <w:r>
+        <w:rPr>
+          <w:lang w:val="en-US"/>
+        </w:rPr>
+        <w:t xml:space="preserve">  "</w:t>
+      </w:r>
+      <w:proofErr w:type="spellStart"/>
+      <w:r>
+        <w:rPr>
+          <w:lang w:val="en-US"/>
+        </w:rPr>
+        <w:t>optimizer_state_dict</w:t>
+      </w:r>
+      <w:proofErr w:type="spellEnd"/>
+      <w:r>
+        <w:rPr>
+          <w:lang w:val="en-US"/>
+        </w:rPr>
+        <w:t>": ...,</w:t>
+      </w:r>
+    </w:p>
+    <w:p>
+      <w:pPr>
+        <w:rPr>
+          <w:lang w:val="en-US"/>
+        </w:rPr>
+      </w:pPr>
+      <w:r>
+        <w:rPr>
+          <w:lang w:val="en-US"/>
+        </w:rPr>
+        <w:t xml:space="preserve">  "</w:t>
+      </w:r>
+      <w:proofErr w:type="spellStart"/>
+      <w:r>
+        <w:rPr>
+          <w:lang w:val="en-US"/>
+        </w:rPr>
+        <w:t>num_batches</w:t>
+      </w:r>
+      <w:proofErr w:type="spellEnd"/>
+      <w:r>
+        <w:rPr>
+          <w:lang w:val="en-US"/>
+        </w:rPr>
+        <w:t>": int,</w:t>
+      </w:r>
+    </w:p>
+    <w:p>
+      <w:pPr>
+        <w:rPr>
+          <w:lang w:val="en-US"/>
+        </w:rPr>
+      </w:pPr>
+      <w:r>
+        <w:rPr>
+          <w:lang w:val="en-US"/>
+        </w:rPr>
+        <w:t xml:space="preserve">  "</w:t>
+      </w:r>
+      <w:proofErr w:type="spellStart"/>
+      <w:r>
+        <w:rPr>
+          <w:lang w:val="en-US"/>
+        </w:rPr>
+        <w:t>train_loss</w:t>
+      </w:r>
+      <w:proofErr w:type="spellEnd"/>
+      <w:r>
+        <w:rPr>
+          <w:lang w:val="en-US"/>
+        </w:rPr>
+        <w:t>": float,          # Training loss at overfit trigger</w:t>
+      </w:r>
+    </w:p>
+    <w:p>
+      <w:pPr>
+        <w:rPr>
+          <w:lang w:val="en-US"/>
+        </w:rPr>
+      </w:pPr>
+      <w:r>
+        <w:rPr>
+          <w:lang w:val="en-US"/>
+        </w:rPr>
+        <w:t xml:space="preserve">  "</w:t>
+      </w:r>
+      <w:proofErr w:type="spellStart"/>
+      <w:r>
+        <w:rPr>
+          <w:lang w:val="en-US"/>
+        </w:rPr>
+        <w:t>validation_loss</w:t>
+      </w:r>
+      <w:proofErr w:type="spellEnd"/>
+      <w:r>
+        <w:rPr>
+          <w:lang w:val="en-US"/>
+        </w:rPr>
+        <w:t>": float,     # Validation loss at overfit trigger</w:t>
+      </w:r>
+    </w:p>
+    <w:p>
+      <w:pPr>
+        <w:rPr>
+          <w:lang w:val="en-US"/>
+        </w:rPr>
+      </w:pPr>
+      <w:r>
+        <w:rPr>
+          <w:lang w:val="en-US"/>
+        </w:rPr>
+        <w:t xml:space="preserve">  "</w:t>
+      </w:r>
+      <w:proofErr w:type="spellStart"/>
+      <w:r>
+        <w:rPr>
+          <w:lang w:val="en-US"/>
+        </w:rPr>
+        <w:t>hyperparams</w:t>
+      </w:r>
+      <w:proofErr w:type="spellEnd"/>
+      <w:r>
+        <w:rPr>
+          <w:lang w:val="en-US"/>
+        </w:rPr>
+        <w:t>": {</w:t>
+      </w:r>
+    </w:p>
+    <w:p>
+      <w:pPr>
+        <w:rPr>
+          <w:lang w:val="en-US"/>
+        </w:rPr>
+      </w:pPr>
+      <w:r>
+        <w:rPr>
+          <w:lang w:val="en-US"/>
+        </w:rPr>
+        <w:t xml:space="preserve">    "</w:t>
+      </w:r>
+      <w:proofErr w:type="spellStart"/>
+      <w:r>
+        <w:rPr>
+          <w:lang w:val="en-US"/>
+        </w:rPr>
+        <w:t>seq_len</w:t>
+      </w:r>
+      <w:proofErr w:type="spellEnd"/>
+      <w:r>
+        <w:rPr>
+          <w:lang w:val="en-US"/>
+        </w:rPr>
+        <w:t>": int,</w:t>
+      </w:r>
+    </w:p>
+    <w:p>
+      <w:pPr>
+        <w:rPr>
+          <w:lang w:val="en-US"/>
+        </w:rPr>
+      </w:pPr>
+      <w:r>
+        <w:rPr>
+          <w:lang w:val="en-US"/>
+        </w:rPr>
+        <w:t xml:space="preserve">    "</w:t>
+      </w:r>
+      <w:proofErr w:type="spellStart"/>
+      <w:r>
+        <w:rPr>
+          <w:lang w:val="en-US"/>
+        </w:rPr>
+        <w:t>n_layers</w:t>
+      </w:r>
+      <w:proofErr w:type="spellEnd"/>
+      <w:r>
+        <w:rPr>
+          <w:lang w:val="en-US"/>
+        </w:rPr>
+        <w:t>": int,</w:t>
+      </w:r>
+    </w:p>
+    <w:p>
+      <w:pPr>
+        <w:rPr>
+          <w:lang w:val="en-US"/>
+        </w:rPr>
+      </w:pPr>
+      <w:r>
+        <w:rPr>
+          <w:lang w:val="en-US"/>
+        </w:rPr>
+        <w:t xml:space="preserve">    "</w:t>
+      </w:r>
+      <w:proofErr w:type="spellStart"/>
+      <w:r>
+        <w:rPr>
+          <w:lang w:val="en-US"/>
+        </w:rPr>
+        <w:t>n_heads</w:t>
+      </w:r>
+      <w:proofErr w:type="spellEnd"/>
+      <w:r>
+        <w:rPr>
+          <w:lang w:val="en-US"/>
+        </w:rPr>
+        <w:t>": int,</w:t>
+      </w:r>
+    </w:p>
+    <w:p>
+      <w:pPr>
+        <w:rPr>
+          <w:lang w:val="en-US"/>
+        </w:rPr>
+      </w:pPr>
+      <w:r>
+        <w:rPr>
+          <w:lang w:val="en-US"/>
+        </w:rPr>
+        <w:t xml:space="preserve">    "</w:t>
+      </w:r>
+      <w:proofErr w:type="spellStart"/>
+      <w:r>
+        <w:rPr>
+          <w:lang w:val="en-US"/>
+        </w:rPr>
+        <w:t>embed_size</w:t>
+      </w:r>
+      <w:proofErr w:type="spellEnd"/>
+      <w:r>
+        <w:rPr>
+          <w:lang w:val="en-US"/>
+        </w:rPr>
+        <w:t>": int,</w:t>
+      </w:r>
+    </w:p>
+    <w:p>
+      <w:pPr>
+        <w:rPr>
+          <w:lang w:val="en-US"/>
+        </w:rPr>
+      </w:pPr>
+      <w:r>
+        <w:rPr>
+          <w:lang w:val="en-US"/>
+        </w:rPr>
+        <w:t xml:space="preserve">    "</w:t>
+      </w:r>
+      <w:proofErr w:type="spellStart"/>
+      <w:r>
+        <w:rPr>
+          <w:lang w:val="en-US"/>
+        </w:rPr>
+        <w:t>mlp_hidden_size</w:t>
+      </w:r>
+      <w:proofErr w:type="spellEnd"/>
+      <w:r>
+        <w:rPr>
+          <w:lang w:val="en-US"/>
+        </w:rPr>
+        <w:t>": int,</w:t>
+      </w:r>
+    </w:p>
+    <w:p>
+      <w:pPr>
+        <w:rPr>
+          <w:lang w:val="en-US"/>
+        </w:rPr>
+      </w:pPr>
+      <w:r>
+        <w:rPr>
+          <w:lang w:val="en-US"/>
+        </w:rPr>
+        <w:lastRenderedPageBreak/>
+        <w:t xml:space="preserve">    "</w:t>
+      </w:r>
+      <w:proofErr w:type="spellStart"/>
+      <w:r>
+        <w:rPr>
+          <w:lang w:val="en-US"/>
+        </w:rPr>
+        <w:t>learning_rate</w:t>
+      </w:r>
+      <w:proofErr w:type="spellEnd"/>
+      <w:r>
+        <w:rPr>
+          <w:lang w:val="en-US"/>
+        </w:rPr>
+        <w:t>": float,</w:t>
+      </w:r>
+    </w:p>
+    <w:p>
+      <w:pPr>
+        <w:rPr>
+          <w:lang w:val="en-US"/>
+        </w:rPr>
+      </w:pPr>
+      <w:r>
+        <w:rPr>
+          <w:lang w:val="en-US"/>
+        </w:rPr>
+        <w:t xml:space="preserve">    "</w:t>
+      </w:r>
+      <w:proofErr w:type="spellStart"/>
+      <w:r>
+        <w:rPr>
+          <w:lang w:val="en-US"/>
+        </w:rPr>
+        <w:t>weight_decay</w:t>
+      </w:r>
+      <w:proofErr w:type="spellEnd"/>
+      <w:r>
+        <w:rPr>
+          <w:lang w:val="en-US"/>
+        </w:rPr>
+        <w:t>": float</w:t>
+      </w:r>
+    </w:p>
+    <w:p>
+      <w:pPr>
+        <w:rPr>
+          <w:lang w:val="en-US"/>
+        </w:rPr>
+      </w:pPr>
+      <w:r>
+        <w:rPr>
+          <w:lang w:val="en-US"/>
+        </w:rPr>
+        <w:t xml:space="preserve">  },</w:t>
+      </w:r>
+    </w:p>
+    <w:p>
+      <w:pPr>
+        <w:rPr>
+          <w:lang w:val="en-US"/>
+        </w:rPr>
+      </w:pPr>
+      <w:r>
+        <w:rPr>
+          <w:lang w:val="en-US"/>
+        </w:rPr>
+        <w:t xml:space="preserve">  "</w:t>
+      </w:r>
+      <w:proofErr w:type="spellStart"/>
+      <w:r>
+        <w:rPr>
+          <w:lang w:val="en-US"/>
+        </w:rPr>
+        <w:t>trial_index</w:t>
+      </w:r>
+      <w:proofErr w:type="spellEnd"/>
+      <w:r>
+        <w:rPr>
+          <w:lang w:val="en-US"/>
+        </w:rPr>
+        <w:t>": int</w:t>
+      </w:r>
+    </w:p>
+    <w:p>
+      <w:pPr>
+        <w:rPr>
+          <w:lang w:val="en-US"/>
+        </w:rPr>
+      </w:pPr>
+      <w:r>
+        <w:rPr>
+          <w:lang w:val="en-US"/>
+        </w:rPr>
+        <w:t>}</w:t>
+      </w:r>
     </w:p>
     <w:sectPr>
       <w:headerReference w:type="default" r:id="rId71"/>
@@ -4661,21 +6284,7 @@
       <w:rPr>
         <w:lang w:val="en-US"/>
       </w:rPr>
-      <w:t>Ariel Blumstein 330430554</w:t>
-    </w:r>
-  </w:p>
-  <w:p>
-    <w:pPr>
-      <w:pStyle w:val="Header"/>
-      <w:rPr>
-        <w:lang w:val="en-US"/>
-      </w:rPr>
-    </w:pPr>
-    <w:r>
-      <w:rPr>
-        <w:lang w:val="en-US"/>
-      </w:rPr>
-      <w:t xml:space="preserve">Itamar Shalev 208750026 </w:t>
+      <w:t xml:space="preserve"> </w:t>
     </w:r>
   </w:p>
 </w:hdr>
@@ -5095,6 +6704,304 @@
     </w:lvl>
   </w:abstractNum>
   <w:abstractNum w:abstractNumId="3" w15:restartNumberingAfterBreak="0">
+    <w:nsid w:val="0FF7363D"/>
+    <w:multiLevelType w:val="multilevel"/>
+    <w:tmpl w:val="EB2EDDAA"/>
+    <w:lvl w:ilvl="0">
+      <w:start w:val="1"/>
+      <w:numFmt w:val="bullet"/>
+      <w:lvlText w:val=""/>
+      <w:lvlJc w:val="left"/>
+      <w:pPr>
+        <w:tabs>
+          <w:tab w:val="num" w:pos="720"/>
+        </w:tabs>
+        <w:ind w:left="720" w:hanging="360"/>
+      </w:pPr>
+      <w:rPr>
+        <w:rFonts w:ascii="Symbol" w:hAnsi="Symbol" w:hint="default"/>
+        <w:sz w:val="20"/>
+      </w:rPr>
+    </w:lvl>
+    <w:lvl w:ilvl="1" w:tentative="1">
+      <w:start w:val="1"/>
+      <w:numFmt w:val="bullet"/>
+      <w:lvlText w:val="o"/>
+      <w:lvlJc w:val="left"/>
+      <w:pPr>
+        <w:tabs>
+          <w:tab w:val="num" w:pos="1440"/>
+        </w:tabs>
+        <w:ind w:left="1440" w:hanging="360"/>
+      </w:pPr>
+      <w:rPr>
+        <w:rFonts w:ascii="Courier New" w:hAnsi="Courier New" w:hint="default"/>
+        <w:sz w:val="20"/>
+      </w:rPr>
+    </w:lvl>
+    <w:lvl w:ilvl="2" w:tentative="1">
+      <w:start w:val="1"/>
+      <w:numFmt w:val="bullet"/>
+      <w:lvlText w:val=""/>
+      <w:lvlJc w:val="left"/>
+      <w:pPr>
+        <w:tabs>
+          <w:tab w:val="num" w:pos="2160"/>
+        </w:tabs>
+        <w:ind w:left="2160" w:hanging="360"/>
+      </w:pPr>
+      <w:rPr>
+        <w:rFonts w:ascii="Wingdings" w:hAnsi="Wingdings" w:hint="default"/>
+        <w:sz w:val="20"/>
+      </w:rPr>
+    </w:lvl>
+    <w:lvl w:ilvl="3" w:tentative="1">
+      <w:start w:val="1"/>
+      <w:numFmt w:val="bullet"/>
+      <w:lvlText w:val=""/>
+      <w:lvlJc w:val="left"/>
+      <w:pPr>
+        <w:tabs>
+          <w:tab w:val="num" w:pos="2880"/>
+        </w:tabs>
+        <w:ind w:left="2880" w:hanging="360"/>
+      </w:pPr>
+      <w:rPr>
+        <w:rFonts w:ascii="Wingdings" w:hAnsi="Wingdings" w:hint="default"/>
+        <w:sz w:val="20"/>
+      </w:rPr>
+    </w:lvl>
+    <w:lvl w:ilvl="4" w:tentative="1">
+      <w:start w:val="1"/>
+      <w:numFmt w:val="bullet"/>
+      <w:lvlText w:val=""/>
+      <w:lvlJc w:val="left"/>
+      <w:pPr>
+        <w:tabs>
+          <w:tab w:val="num" w:pos="3600"/>
+        </w:tabs>
+        <w:ind w:left="3600" w:hanging="360"/>
+      </w:pPr>
+      <w:rPr>
+        <w:rFonts w:ascii="Wingdings" w:hAnsi="Wingdings" w:hint="default"/>
+        <w:sz w:val="20"/>
+      </w:rPr>
+    </w:lvl>
+    <w:lvl w:ilvl="5" w:tentative="1">
+      <w:start w:val="1"/>
+      <w:numFmt w:val="bullet"/>
+      <w:lvlText w:val=""/>
+      <w:lvlJc w:val="left"/>
+      <w:pPr>
+        <w:tabs>
+          <w:tab w:val="num" w:pos="4320"/>
+        </w:tabs>
+        <w:ind w:left="4320" w:hanging="360"/>
+      </w:pPr>
+      <w:rPr>
+        <w:rFonts w:ascii="Wingdings" w:hAnsi="Wingdings" w:hint="default"/>
+        <w:sz w:val="20"/>
+      </w:rPr>
+    </w:lvl>
+    <w:lvl w:ilvl="6" w:tentative="1">
+      <w:start w:val="1"/>
+      <w:numFmt w:val="bullet"/>
+      <w:lvlText w:val=""/>
+      <w:lvlJc w:val="left"/>
+      <w:pPr>
+        <w:tabs>
+          <w:tab w:val="num" w:pos="5040"/>
+        </w:tabs>
+        <w:ind w:left="5040" w:hanging="360"/>
+      </w:pPr>
+      <w:rPr>
+        <w:rFonts w:ascii="Wingdings" w:hAnsi="Wingdings" w:hint="default"/>
+        <w:sz w:val="20"/>
+      </w:rPr>
+    </w:lvl>
+    <w:lvl w:ilvl="7" w:tentative="1">
+      <w:start w:val="1"/>
+      <w:numFmt w:val="bullet"/>
+      <w:lvlText w:val=""/>
+      <w:lvlJc w:val="left"/>
+      <w:pPr>
+        <w:tabs>
+          <w:tab w:val="num" w:pos="5760"/>
+        </w:tabs>
+        <w:ind w:left="5760" w:hanging="360"/>
+      </w:pPr>
+      <w:rPr>
+        <w:rFonts w:ascii="Wingdings" w:hAnsi="Wingdings" w:hint="default"/>
+        <w:sz w:val="20"/>
+      </w:rPr>
+    </w:lvl>
+    <w:lvl w:ilvl="8" w:tentative="1">
+      <w:start w:val="1"/>
+      <w:numFmt w:val="bullet"/>
+      <w:lvlText w:val=""/>
+      <w:lvlJc w:val="left"/>
+      <w:pPr>
+        <w:tabs>
+          <w:tab w:val="num" w:pos="6480"/>
+        </w:tabs>
+        <w:ind w:left="6480" w:hanging="360"/>
+      </w:pPr>
+      <w:rPr>
+        <w:rFonts w:ascii="Wingdings" w:hAnsi="Wingdings" w:hint="default"/>
+        <w:sz w:val="20"/>
+      </w:rPr>
+    </w:lvl>
+  </w:abstractNum>
+  <w:abstractNum w:abstractNumId="4" w15:restartNumberingAfterBreak="0">
+    <w:nsid w:val="207F6F82"/>
+    <w:multiLevelType w:val="multilevel"/>
+    <w:tmpl w:val="18C001CA"/>
+    <w:lvl w:ilvl="0">
+      <w:start w:val="1"/>
+      <w:numFmt w:val="bullet"/>
+      <w:lvlText w:val=""/>
+      <w:lvlJc w:val="left"/>
+      <w:pPr>
+        <w:tabs>
+          <w:tab w:val="num" w:pos="720"/>
+        </w:tabs>
+        <w:ind w:left="720" w:hanging="360"/>
+      </w:pPr>
+      <w:rPr>
+        <w:rFonts w:ascii="Symbol" w:hAnsi="Symbol" w:hint="default"/>
+        <w:sz w:val="20"/>
+      </w:rPr>
+    </w:lvl>
+    <w:lvl w:ilvl="1" w:tentative="1">
+      <w:start w:val="1"/>
+      <w:numFmt w:val="bullet"/>
+      <w:lvlText w:val="o"/>
+      <w:lvlJc w:val="left"/>
+      <w:pPr>
+        <w:tabs>
+          <w:tab w:val="num" w:pos="1440"/>
+        </w:tabs>
+        <w:ind w:left="1440" w:hanging="360"/>
+      </w:pPr>
+      <w:rPr>
+        <w:rFonts w:ascii="Courier New" w:hAnsi="Courier New" w:hint="default"/>
+        <w:sz w:val="20"/>
+      </w:rPr>
+    </w:lvl>
+    <w:lvl w:ilvl="2" w:tentative="1">
+      <w:start w:val="1"/>
+      <w:numFmt w:val="bullet"/>
+      <w:lvlText w:val=""/>
+      <w:lvlJc w:val="left"/>
+      <w:pPr>
+        <w:tabs>
+          <w:tab w:val="num" w:pos="2160"/>
+        </w:tabs>
+        <w:ind w:left="2160" w:hanging="360"/>
+      </w:pPr>
+      <w:rPr>
+        <w:rFonts w:ascii="Wingdings" w:hAnsi="Wingdings" w:hint="default"/>
+        <w:sz w:val="20"/>
+      </w:rPr>
+    </w:lvl>
+    <w:lvl w:ilvl="3" w:tentative="1">
+      <w:start w:val="1"/>
+      <w:numFmt w:val="bullet"/>
+      <w:lvlText w:val=""/>
+      <w:lvlJc w:val="left"/>
+      <w:pPr>
+        <w:tabs>
+          <w:tab w:val="num" w:pos="2880"/>
+        </w:tabs>
+        <w:ind w:left="2880" w:hanging="360"/>
+      </w:pPr>
+      <w:rPr>
+        <w:rFonts w:ascii="Wingdings" w:hAnsi="Wingdings" w:hint="default"/>
+        <w:sz w:val="20"/>
+      </w:rPr>
+    </w:lvl>
+    <w:lvl w:ilvl="4" w:tentative="1">
+      <w:start w:val="1"/>
+      <w:numFmt w:val="bullet"/>
+      <w:lvlText w:val=""/>
+      <w:lvlJc w:val="left"/>
+      <w:pPr>
+        <w:tabs>
+          <w:tab w:val="num" w:pos="3600"/>
+        </w:tabs>
+        <w:ind w:left="3600" w:hanging="360"/>
+      </w:pPr>
+      <w:rPr>
+        <w:rFonts w:ascii="Wingdings" w:hAnsi="Wingdings" w:hint="default"/>
+        <w:sz w:val="20"/>
+      </w:rPr>
+    </w:lvl>
+    <w:lvl w:ilvl="5" w:tentative="1">
+      <w:start w:val="1"/>
+      <w:numFmt w:val="bullet"/>
+      <w:lvlText w:val=""/>
+      <w:lvlJc w:val="left"/>
+      <w:pPr>
+        <w:tabs>
+          <w:tab w:val="num" w:pos="4320"/>
+        </w:tabs>
+        <w:ind w:left="4320" w:hanging="360"/>
+      </w:pPr>
+      <w:rPr>
+        <w:rFonts w:ascii="Wingdings" w:hAnsi="Wingdings" w:hint="default"/>
+        <w:sz w:val="20"/>
+      </w:rPr>
+    </w:lvl>
+    <w:lvl w:ilvl="6" w:tentative="1">
+      <w:start w:val="1"/>
+      <w:numFmt w:val="bullet"/>
+      <w:lvlText w:val=""/>
+      <w:lvlJc w:val="left"/>
+      <w:pPr>
+        <w:tabs>
+          <w:tab w:val="num" w:pos="5040"/>
+        </w:tabs>
+        <w:ind w:left="5040" w:hanging="360"/>
+      </w:pPr>
+      <w:rPr>
+        <w:rFonts w:ascii="Wingdings" w:hAnsi="Wingdings" w:hint="default"/>
+        <w:sz w:val="20"/>
+      </w:rPr>
+    </w:lvl>
+    <w:lvl w:ilvl="7" w:tentative="1">
+      <w:start w:val="1"/>
+      <w:numFmt w:val="bullet"/>
+      <w:lvlText w:val=""/>
+      <w:lvlJc w:val="left"/>
+      <w:pPr>
+        <w:tabs>
+          <w:tab w:val="num" w:pos="5760"/>
+        </w:tabs>
+        <w:ind w:left="5760" w:hanging="360"/>
+      </w:pPr>
+      <w:rPr>
+        <w:rFonts w:ascii="Wingdings" w:hAnsi="Wingdings" w:hint="default"/>
+        <w:sz w:val="20"/>
+      </w:rPr>
+    </w:lvl>
+    <w:lvl w:ilvl="8" w:tentative="1">
+      <w:start w:val="1"/>
+      <w:numFmt w:val="bullet"/>
+      <w:lvlText w:val=""/>
+      <w:lvlJc w:val="left"/>
+      <w:pPr>
+        <w:tabs>
+          <w:tab w:val="num" w:pos="6480"/>
+        </w:tabs>
+        <w:ind w:left="6480" w:hanging="360"/>
+      </w:pPr>
+      <w:rPr>
+        <w:rFonts w:ascii="Wingdings" w:hAnsi="Wingdings" w:hint="default"/>
+        <w:sz w:val="20"/>
+      </w:rPr>
+    </w:lvl>
+  </w:abstractNum>
+  <w:abstractNum w:abstractNumId="5" w15:restartNumberingAfterBreak="0">
     <w:nsid w:val="270243A1"/>
     <w:multiLevelType w:val="multilevel"/>
     <w:tmpl w:val="7110CDD0"/>
@@ -5243,7 +7150,7 @@
       </w:rPr>
     </w:lvl>
   </w:abstractNum>
-  <w:abstractNum w:abstractNumId="4" w15:restartNumberingAfterBreak="0">
+  <w:abstractNum w:abstractNumId="6" w15:restartNumberingAfterBreak="0">
     <w:nsid w:val="2FE92AAF"/>
     <w:multiLevelType w:val="multilevel"/>
     <w:tmpl w:val="50D6B61C"/>
@@ -5392,7 +7299,7 @@
       </w:rPr>
     </w:lvl>
   </w:abstractNum>
-  <w:abstractNum w:abstractNumId="5" w15:restartNumberingAfterBreak="0">
+  <w:abstractNum w:abstractNumId="7" w15:restartNumberingAfterBreak="0">
     <w:nsid w:val="34DA4E5D"/>
     <w:multiLevelType w:val="multilevel"/>
     <w:tmpl w:val="3050B236"/>
@@ -5541,7 +7448,7 @@
       </w:rPr>
     </w:lvl>
   </w:abstractNum>
-  <w:abstractNum w:abstractNumId="6" w15:restartNumberingAfterBreak="0">
+  <w:abstractNum w:abstractNumId="8" w15:restartNumberingAfterBreak="0">
     <w:nsid w:val="411D37C1"/>
     <w:multiLevelType w:val="multilevel"/>
     <w:tmpl w:val="3A543278"/>
@@ -5690,7 +7597,7 @@
       </w:rPr>
     </w:lvl>
   </w:abstractNum>
-  <w:abstractNum w:abstractNumId="7" w15:restartNumberingAfterBreak="0">
+  <w:abstractNum w:abstractNumId="9" w15:restartNumberingAfterBreak="0">
     <w:nsid w:val="41A6485E"/>
     <w:multiLevelType w:val="multilevel"/>
     <w:tmpl w:val="1FCC5396"/>
@@ -5839,7 +7746,7 @@
       </w:rPr>
     </w:lvl>
   </w:abstractNum>
-  <w:abstractNum w:abstractNumId="8" w15:restartNumberingAfterBreak="0">
+  <w:abstractNum w:abstractNumId="10" w15:restartNumberingAfterBreak="0">
     <w:nsid w:val="485408EA"/>
     <w:multiLevelType w:val="multilevel"/>
     <w:tmpl w:val="38243D10"/>
@@ -5988,7 +7895,156 @@
       </w:rPr>
     </w:lvl>
   </w:abstractNum>
-  <w:abstractNum w:abstractNumId="9" w15:restartNumberingAfterBreak="0">
+  <w:abstractNum w:abstractNumId="11" w15:restartNumberingAfterBreak="0">
+    <w:nsid w:val="491B4A7D"/>
+    <w:multiLevelType w:val="multilevel"/>
+    <w:tmpl w:val="A9DA83E4"/>
+    <w:lvl w:ilvl="0">
+      <w:start w:val="1"/>
+      <w:numFmt w:val="bullet"/>
+      <w:lvlText w:val=""/>
+      <w:lvlJc w:val="left"/>
+      <w:pPr>
+        <w:tabs>
+          <w:tab w:val="num" w:pos="720"/>
+        </w:tabs>
+        <w:ind w:left="720" w:hanging="360"/>
+      </w:pPr>
+      <w:rPr>
+        <w:rFonts w:ascii="Symbol" w:hAnsi="Symbol" w:hint="default"/>
+        <w:sz w:val="20"/>
+      </w:rPr>
+    </w:lvl>
+    <w:lvl w:ilvl="1" w:tentative="1">
+      <w:start w:val="1"/>
+      <w:numFmt w:val="bullet"/>
+      <w:lvlText w:val="o"/>
+      <w:lvlJc w:val="left"/>
+      <w:pPr>
+        <w:tabs>
+          <w:tab w:val="num" w:pos="1440"/>
+        </w:tabs>
+        <w:ind w:left="1440" w:hanging="360"/>
+      </w:pPr>
+      <w:rPr>
+        <w:rFonts w:ascii="Courier New" w:hAnsi="Courier New" w:hint="default"/>
+        <w:sz w:val="20"/>
+      </w:rPr>
+    </w:lvl>
+    <w:lvl w:ilvl="2" w:tentative="1">
+      <w:start w:val="1"/>
+      <w:numFmt w:val="bullet"/>
+      <w:lvlText w:val=""/>
+      <w:lvlJc w:val="left"/>
+      <w:pPr>
+        <w:tabs>
+          <w:tab w:val="num" w:pos="2160"/>
+        </w:tabs>
+        <w:ind w:left="2160" w:hanging="360"/>
+      </w:pPr>
+      <w:rPr>
+        <w:rFonts w:ascii="Wingdings" w:hAnsi="Wingdings" w:hint="default"/>
+        <w:sz w:val="20"/>
+      </w:rPr>
+    </w:lvl>
+    <w:lvl w:ilvl="3" w:tentative="1">
+      <w:start w:val="1"/>
+      <w:numFmt w:val="bullet"/>
+      <w:lvlText w:val=""/>
+      <w:lvlJc w:val="left"/>
+      <w:pPr>
+        <w:tabs>
+          <w:tab w:val="num" w:pos="2880"/>
+        </w:tabs>
+        <w:ind w:left="2880" w:hanging="360"/>
+      </w:pPr>
+      <w:rPr>
+        <w:rFonts w:ascii="Wingdings" w:hAnsi="Wingdings" w:hint="default"/>
+        <w:sz w:val="20"/>
+      </w:rPr>
+    </w:lvl>
+    <w:lvl w:ilvl="4" w:tentative="1">
+      <w:start w:val="1"/>
+      <w:numFmt w:val="bullet"/>
+      <w:lvlText w:val=""/>
+      <w:lvlJc w:val="left"/>
+      <w:pPr>
+        <w:tabs>
+          <w:tab w:val="num" w:pos="3600"/>
+        </w:tabs>
+        <w:ind w:left="3600" w:hanging="360"/>
+      </w:pPr>
+      <w:rPr>
+        <w:rFonts w:ascii="Wingdings" w:hAnsi="Wingdings" w:hint="default"/>
+        <w:sz w:val="20"/>
+      </w:rPr>
+    </w:lvl>
+    <w:lvl w:ilvl="5" w:tentative="1">
+      <w:start w:val="1"/>
+      <w:numFmt w:val="bullet"/>
+      <w:lvlText w:val=""/>
+      <w:lvlJc w:val="left"/>
+      <w:pPr>
+        <w:tabs>
+          <w:tab w:val="num" w:pos="4320"/>
+        </w:tabs>
+        <w:ind w:left="4320" w:hanging="360"/>
+      </w:pPr>
+      <w:rPr>
+        <w:rFonts w:ascii="Wingdings" w:hAnsi="Wingdings" w:hint="default"/>
+        <w:sz w:val="20"/>
+      </w:rPr>
+    </w:lvl>
+    <w:lvl w:ilvl="6" w:tentative="1">
+      <w:start w:val="1"/>
+      <w:numFmt w:val="bullet"/>
+      <w:lvlText w:val=""/>
+      <w:lvlJc w:val="left"/>
+      <w:pPr>
+        <w:tabs>
+          <w:tab w:val="num" w:pos="5040"/>
+        </w:tabs>
+        <w:ind w:left="5040" w:hanging="360"/>
+      </w:pPr>
+      <w:rPr>
+        <w:rFonts w:ascii="Wingdings" w:hAnsi="Wingdings" w:hint="default"/>
+        <w:sz w:val="20"/>
+      </w:rPr>
+    </w:lvl>
+    <w:lvl w:ilvl="7" w:tentative="1">
+      <w:start w:val="1"/>
+      <w:numFmt w:val="bullet"/>
+      <w:lvlText w:val=""/>
+      <w:lvlJc w:val="left"/>
+      <w:pPr>
+        <w:tabs>
+          <w:tab w:val="num" w:pos="5760"/>
+        </w:tabs>
+        <w:ind w:left="5760" w:hanging="360"/>
+      </w:pPr>
+      <w:rPr>
+        <w:rFonts w:ascii="Wingdings" w:hAnsi="Wingdings" w:hint="default"/>
+        <w:sz w:val="20"/>
+      </w:rPr>
+    </w:lvl>
+    <w:lvl w:ilvl="8" w:tentative="1">
+      <w:start w:val="1"/>
+      <w:numFmt w:val="bullet"/>
+      <w:lvlText w:val=""/>
+      <w:lvlJc w:val="left"/>
+      <w:pPr>
+        <w:tabs>
+          <w:tab w:val="num" w:pos="6480"/>
+        </w:tabs>
+        <w:ind w:left="6480" w:hanging="360"/>
+      </w:pPr>
+      <w:rPr>
+        <w:rFonts w:ascii="Wingdings" w:hAnsi="Wingdings" w:hint="default"/>
+        <w:sz w:val="20"/>
+      </w:rPr>
+    </w:lvl>
+  </w:abstractNum>
+  <w:abstractNum w:abstractNumId="12" w15:restartNumberingAfterBreak="0">
     <w:nsid w:val="4E682EA0"/>
     <w:multiLevelType w:val="multilevel"/>
     <w:tmpl w:val="F8EC3664"/>
@@ -6101,7 +8157,305 @@
       </w:pPr>
     </w:lvl>
   </w:abstractNum>
-  <w:abstractNum w:abstractNumId="10" w15:restartNumberingAfterBreak="0">
+  <w:abstractNum w:abstractNumId="13" w15:restartNumberingAfterBreak="0">
+    <w:nsid w:val="56344CDB"/>
+    <w:multiLevelType w:val="multilevel"/>
+    <w:tmpl w:val="6A3888AC"/>
+    <w:lvl w:ilvl="0">
+      <w:start w:val="1"/>
+      <w:numFmt w:val="bullet"/>
+      <w:lvlText w:val=""/>
+      <w:lvlJc w:val="left"/>
+      <w:pPr>
+        <w:tabs>
+          <w:tab w:val="num" w:pos="720"/>
+        </w:tabs>
+        <w:ind w:left="720" w:hanging="360"/>
+      </w:pPr>
+      <w:rPr>
+        <w:rFonts w:ascii="Symbol" w:hAnsi="Symbol" w:hint="default"/>
+        <w:sz w:val="20"/>
+      </w:rPr>
+    </w:lvl>
+    <w:lvl w:ilvl="1" w:tentative="1">
+      <w:start w:val="1"/>
+      <w:numFmt w:val="bullet"/>
+      <w:lvlText w:val="o"/>
+      <w:lvlJc w:val="left"/>
+      <w:pPr>
+        <w:tabs>
+          <w:tab w:val="num" w:pos="1440"/>
+        </w:tabs>
+        <w:ind w:left="1440" w:hanging="360"/>
+      </w:pPr>
+      <w:rPr>
+        <w:rFonts w:ascii="Courier New" w:hAnsi="Courier New" w:hint="default"/>
+        <w:sz w:val="20"/>
+      </w:rPr>
+    </w:lvl>
+    <w:lvl w:ilvl="2" w:tentative="1">
+      <w:start w:val="1"/>
+      <w:numFmt w:val="bullet"/>
+      <w:lvlText w:val=""/>
+      <w:lvlJc w:val="left"/>
+      <w:pPr>
+        <w:tabs>
+          <w:tab w:val="num" w:pos="2160"/>
+        </w:tabs>
+        <w:ind w:left="2160" w:hanging="360"/>
+      </w:pPr>
+      <w:rPr>
+        <w:rFonts w:ascii="Wingdings" w:hAnsi="Wingdings" w:hint="default"/>
+        <w:sz w:val="20"/>
+      </w:rPr>
+    </w:lvl>
+    <w:lvl w:ilvl="3" w:tentative="1">
+      <w:start w:val="1"/>
+      <w:numFmt w:val="bullet"/>
+      <w:lvlText w:val=""/>
+      <w:lvlJc w:val="left"/>
+      <w:pPr>
+        <w:tabs>
+          <w:tab w:val="num" w:pos="2880"/>
+        </w:tabs>
+        <w:ind w:left="2880" w:hanging="360"/>
+      </w:pPr>
+      <w:rPr>
+        <w:rFonts w:ascii="Wingdings" w:hAnsi="Wingdings" w:hint="default"/>
+        <w:sz w:val="20"/>
+      </w:rPr>
+    </w:lvl>
+    <w:lvl w:ilvl="4" w:tentative="1">
+      <w:start w:val="1"/>
+      <w:numFmt w:val="bullet"/>
+      <w:lvlText w:val=""/>
+      <w:lvlJc w:val="left"/>
+      <w:pPr>
+        <w:tabs>
+          <w:tab w:val="num" w:pos="3600"/>
+        </w:tabs>
+        <w:ind w:left="3600" w:hanging="360"/>
+      </w:pPr>
+      <w:rPr>
+        <w:rFonts w:ascii="Wingdings" w:hAnsi="Wingdings" w:hint="default"/>
+        <w:sz w:val="20"/>
+      </w:rPr>
+    </w:lvl>
+    <w:lvl w:ilvl="5" w:tentative="1">
+      <w:start w:val="1"/>
+      <w:numFmt w:val="bullet"/>
+      <w:lvlText w:val=""/>
+      <w:lvlJc w:val="left"/>
+      <w:pPr>
+        <w:tabs>
+          <w:tab w:val="num" w:pos="4320"/>
+        </w:tabs>
+        <w:ind w:left="4320" w:hanging="360"/>
+      </w:pPr>
+      <w:rPr>
+        <w:rFonts w:ascii="Wingdings" w:hAnsi="Wingdings" w:hint="default"/>
+        <w:sz w:val="20"/>
+      </w:rPr>
+    </w:lvl>
+    <w:lvl w:ilvl="6" w:tentative="1">
+      <w:start w:val="1"/>
+      <w:numFmt w:val="bullet"/>
+      <w:lvlText w:val=""/>
+      <w:lvlJc w:val="left"/>
+      <w:pPr>
+        <w:tabs>
+          <w:tab w:val="num" w:pos="5040"/>
+        </w:tabs>
+        <w:ind w:left="5040" w:hanging="360"/>
+      </w:pPr>
+      <w:rPr>
+        <w:rFonts w:ascii="Wingdings" w:hAnsi="Wingdings" w:hint="default"/>
+        <w:sz w:val="20"/>
+      </w:rPr>
+    </w:lvl>
+    <w:lvl w:ilvl="7" w:tentative="1">
+      <w:start w:val="1"/>
+      <w:numFmt w:val="bullet"/>
+      <w:lvlText w:val=""/>
+      <w:lvlJc w:val="left"/>
+      <w:pPr>
+        <w:tabs>
+          <w:tab w:val="num" w:pos="5760"/>
+        </w:tabs>
+        <w:ind w:left="5760" w:hanging="360"/>
+      </w:pPr>
+      <w:rPr>
+        <w:rFonts w:ascii="Wingdings" w:hAnsi="Wingdings" w:hint="default"/>
+        <w:sz w:val="20"/>
+      </w:rPr>
+    </w:lvl>
+    <w:lvl w:ilvl="8" w:tentative="1">
+      <w:start w:val="1"/>
+      <w:numFmt w:val="bullet"/>
+      <w:lvlText w:val=""/>
+      <w:lvlJc w:val="left"/>
+      <w:pPr>
+        <w:tabs>
+          <w:tab w:val="num" w:pos="6480"/>
+        </w:tabs>
+        <w:ind w:left="6480" w:hanging="360"/>
+      </w:pPr>
+      <w:rPr>
+        <w:rFonts w:ascii="Wingdings" w:hAnsi="Wingdings" w:hint="default"/>
+        <w:sz w:val="20"/>
+      </w:rPr>
+    </w:lvl>
+  </w:abstractNum>
+  <w:abstractNum w:abstractNumId="14" w15:restartNumberingAfterBreak="0">
+    <w:nsid w:val="579F4799"/>
+    <w:multiLevelType w:val="multilevel"/>
+    <w:tmpl w:val="07F0E7DE"/>
+    <w:lvl w:ilvl="0">
+      <w:start w:val="1"/>
+      <w:numFmt w:val="bullet"/>
+      <w:lvlText w:val=""/>
+      <w:lvlJc w:val="left"/>
+      <w:pPr>
+        <w:tabs>
+          <w:tab w:val="num" w:pos="720"/>
+        </w:tabs>
+        <w:ind w:left="720" w:hanging="360"/>
+      </w:pPr>
+      <w:rPr>
+        <w:rFonts w:ascii="Symbol" w:hAnsi="Symbol" w:hint="default"/>
+        <w:sz w:val="20"/>
+      </w:rPr>
+    </w:lvl>
+    <w:lvl w:ilvl="1" w:tentative="1">
+      <w:start w:val="1"/>
+      <w:numFmt w:val="bullet"/>
+      <w:lvlText w:val="o"/>
+      <w:lvlJc w:val="left"/>
+      <w:pPr>
+        <w:tabs>
+          <w:tab w:val="num" w:pos="1440"/>
+        </w:tabs>
+        <w:ind w:left="1440" w:hanging="360"/>
+      </w:pPr>
+      <w:rPr>
+        <w:rFonts w:ascii="Courier New" w:hAnsi="Courier New" w:hint="default"/>
+        <w:sz w:val="20"/>
+      </w:rPr>
+    </w:lvl>
+    <w:lvl w:ilvl="2" w:tentative="1">
+      <w:start w:val="1"/>
+      <w:numFmt w:val="bullet"/>
+      <w:lvlText w:val=""/>
+      <w:lvlJc w:val="left"/>
+      <w:pPr>
+        <w:tabs>
+          <w:tab w:val="num" w:pos="2160"/>
+        </w:tabs>
+        <w:ind w:left="2160" w:hanging="360"/>
+      </w:pPr>
+      <w:rPr>
+        <w:rFonts w:ascii="Wingdings" w:hAnsi="Wingdings" w:hint="default"/>
+        <w:sz w:val="20"/>
+      </w:rPr>
+    </w:lvl>
+    <w:lvl w:ilvl="3" w:tentative="1">
+      <w:start w:val="1"/>
+      <w:numFmt w:val="bullet"/>
+      <w:lvlText w:val=""/>
+      <w:lvlJc w:val="left"/>
+      <w:pPr>
+        <w:tabs>
+          <w:tab w:val="num" w:pos="2880"/>
+        </w:tabs>
+        <w:ind w:left="2880" w:hanging="360"/>
+      </w:pPr>
+      <w:rPr>
+        <w:rFonts w:ascii="Wingdings" w:hAnsi="Wingdings" w:hint="default"/>
+        <w:sz w:val="20"/>
+      </w:rPr>
+    </w:lvl>
+    <w:lvl w:ilvl="4" w:tentative="1">
+      <w:start w:val="1"/>
+      <w:numFmt w:val="bullet"/>
+      <w:lvlText w:val=""/>
+      <w:lvlJc w:val="left"/>
+      <w:pPr>
+        <w:tabs>
+          <w:tab w:val="num" w:pos="3600"/>
+        </w:tabs>
+        <w:ind w:left="3600" w:hanging="360"/>
+      </w:pPr>
+      <w:rPr>
+        <w:rFonts w:ascii="Wingdings" w:hAnsi="Wingdings" w:hint="default"/>
+        <w:sz w:val="20"/>
+      </w:rPr>
+    </w:lvl>
+    <w:lvl w:ilvl="5" w:tentative="1">
+      <w:start w:val="1"/>
+      <w:numFmt w:val="bullet"/>
+      <w:lvlText w:val=""/>
+      <w:lvlJc w:val="left"/>
+      <w:pPr>
+        <w:tabs>
+          <w:tab w:val="num" w:pos="4320"/>
+        </w:tabs>
+        <w:ind w:left="4320" w:hanging="360"/>
+      </w:pPr>
+      <w:rPr>
+        <w:rFonts w:ascii="Wingdings" w:hAnsi="Wingdings" w:hint="default"/>
+        <w:sz w:val="20"/>
+      </w:rPr>
+    </w:lvl>
+    <w:lvl w:ilvl="6" w:tentative="1">
+      <w:start w:val="1"/>
+      <w:numFmt w:val="bullet"/>
+      <w:lvlText w:val=""/>
+      <w:lvlJc w:val="left"/>
+      <w:pPr>
+        <w:tabs>
+          <w:tab w:val="num" w:pos="5040"/>
+        </w:tabs>
+        <w:ind w:left="5040" w:hanging="360"/>
+      </w:pPr>
+      <w:rPr>
+        <w:rFonts w:ascii="Wingdings" w:hAnsi="Wingdings" w:hint="default"/>
+        <w:sz w:val="20"/>
+      </w:rPr>
+    </w:lvl>
+    <w:lvl w:ilvl="7" w:tentative="1">
+      <w:start w:val="1"/>
+      <w:numFmt w:val="bullet"/>
+      <w:lvlText w:val=""/>
+      <w:lvlJc w:val="left"/>
+      <w:pPr>
+        <w:tabs>
+          <w:tab w:val="num" w:pos="5760"/>
+        </w:tabs>
+        <w:ind w:left="5760" w:hanging="360"/>
+      </w:pPr>
+      <w:rPr>
+        <w:rFonts w:ascii="Wingdings" w:hAnsi="Wingdings" w:hint="default"/>
+        <w:sz w:val="20"/>
+      </w:rPr>
+    </w:lvl>
+    <w:lvl w:ilvl="8" w:tentative="1">
+      <w:start w:val="1"/>
+      <w:numFmt w:val="bullet"/>
+      <w:lvlText w:val=""/>
+      <w:lvlJc w:val="left"/>
+      <w:pPr>
+        <w:tabs>
+          <w:tab w:val="num" w:pos="6480"/>
+        </w:tabs>
+        <w:ind w:left="6480" w:hanging="360"/>
+      </w:pPr>
+      <w:rPr>
+        <w:rFonts w:ascii="Wingdings" w:hAnsi="Wingdings" w:hint="default"/>
+        <w:sz w:val="20"/>
+      </w:rPr>
+    </w:lvl>
+  </w:abstractNum>
+  <w:abstractNum w:abstractNumId="15" w15:restartNumberingAfterBreak="0">
     <w:nsid w:val="6CFD7A8C"/>
     <w:multiLevelType w:val="multilevel"/>
     <w:tmpl w:val="479C8B9E"/>
@@ -6251,37 +8605,52 @@
     </w:lvl>
   </w:abstractNum>
   <w:num w:numId="1" w16cid:durableId="1105073122">
-    <w:abstractNumId w:val="6"/>
+    <w:abstractNumId w:val="8"/>
   </w:num>
   <w:num w:numId="2" w16cid:durableId="814420703">
-    <w:abstractNumId w:val="3"/>
+    <w:abstractNumId w:val="5"/>
   </w:num>
   <w:num w:numId="3" w16cid:durableId="183902014">
     <w:abstractNumId w:val="2"/>
   </w:num>
   <w:num w:numId="4" w16cid:durableId="882062156">
-    <w:abstractNumId w:val="5"/>
+    <w:abstractNumId w:val="7"/>
   </w:num>
   <w:num w:numId="5" w16cid:durableId="1299650015">
-    <w:abstractNumId w:val="10"/>
+    <w:abstractNumId w:val="15"/>
   </w:num>
   <w:num w:numId="6" w16cid:durableId="2128506360">
-    <w:abstractNumId w:val="7"/>
+    <w:abstractNumId w:val="9"/>
   </w:num>
   <w:num w:numId="7" w16cid:durableId="621303000">
     <w:abstractNumId w:val="1"/>
   </w:num>
   <w:num w:numId="8" w16cid:durableId="1984507815">
-    <w:abstractNumId w:val="4"/>
+    <w:abstractNumId w:val="6"/>
   </w:num>
   <w:num w:numId="9" w16cid:durableId="1836725856">
     <w:abstractNumId w:val="0"/>
   </w:num>
   <w:num w:numId="10" w16cid:durableId="156384236">
-    <w:abstractNumId w:val="9"/>
+    <w:abstractNumId w:val="12"/>
   </w:num>
   <w:num w:numId="11" w16cid:durableId="186138151">
-    <w:abstractNumId w:val="8"/>
+    <w:abstractNumId w:val="10"/>
+  </w:num>
+  <w:num w:numId="12" w16cid:durableId="269747605">
+    <w:abstractNumId w:val="11"/>
+  </w:num>
+  <w:num w:numId="13" w16cid:durableId="1465781211">
+    <w:abstractNumId w:val="14"/>
+  </w:num>
+  <w:num w:numId="14" w16cid:durableId="1255358216">
+    <w:abstractNumId w:val="13"/>
+  </w:num>
+  <w:num w:numId="15" w16cid:durableId="940650126">
+    <w:abstractNumId w:val="3"/>
+  </w:num>
+  <w:num w:numId="16" w16cid:durableId="1842969712">
+    <w:abstractNumId w:val="4"/>
   </w:num>
 </w:numbering>
 </file>
@@ -7261,7 +9630,6 @@
       <w:kern w:val="0"/>
       <w:sz w:val="24"/>
       <w:szCs w:val="24"/>
-      <w:lang/>
       <w14:ligatures w14:val="none"/>
     </w:rPr>
   </w:style>

</xml_diff>